<commit_message>
W-3 and W-1: sample reports regenerated on today's code and finished with LibreOffice (owner 172 a)
tools/build_w03_report_files.py rebuilt the example template and both W-3
reports (Spencer search 1.2572 against the tag; 24 figures / 28 pages and
20 / 21, as the page says); the page's quoted calculation numbers follow the
new report (residuals -3.729e-11 and 9.080e-09 against 371411 and 84335269;
Bishop 485415 / 394283 = 1.231), and its caveat now says only the rounding-
level residuals can differ on another computer. Two page images re-rendered
from the new documents. W-1's sample report had its contents page numbered
(LibreOffice, 11 of 11 entries); the page says the linked copy has been
through that step.

Co-Authored-By: Claude Opus 5.5 <noreply@anthropic.com>
Claude-Session: https://claude.ai/code/session_01XjjT2aBxw8gY7EFdpoUcpj
</commit_message>
<xml_diff>
--- a/docs/tutorials/files/w03_report_example_template.docx
+++ b/docs/tutorials/files/w03_report_example_template.docx
@@ -769,7 +769,7 @@
                 <w:b w:val="0"/>
                 <w:sz w:val="20"/>
               </w:rPr>
-              <w:t>0.4.1</w:t>
+              <w:t>0.5.2</w:t>
             </w:r>
           </w:p>
         </w:tc>
@@ -861,7 +861,7 @@
                 <w:b w:val="0"/>
                 <w:sz w:val="20"/>
               </w:rPr>
-              <w:t>ac004827d402ade762d935c61dd3c100e5ff643656cec091945b00730d581d45</w:t>
+              <w:t>f97a041a006cac346ef9386809fd747a3b9ebba7573aa25e8fc7ccbc58f1b787</w:t>
             </w:r>
           </w:p>
         </w:tc>
@@ -907,7 +907,7 @@
                 <w:b w:val="0"/>
                 <w:sz w:val="20"/>
               </w:rPr>
-              <w:t>2026-09-05 13:28</w:t>
+              <w:t>2026-10-11 09:52</w:t>
             </w:r>
           </w:p>
         </w:tc>
@@ -1382,7 +1382,7 @@
     <w:tbl>
       <w:tblPr>
         <w:tblStyle w:val="TableGrid"/>
-        <w:tblW w:type="dxa" w:w="6636"/>
+        <w:tblW w:type="dxa" w:w="6989"/>
         <w:tblInd w:w="43" w:type="dxa"/>
         <w:tblLayout w:type="fixed"/>
         <w:tblCellMar>
@@ -1402,6 +1402,7 @@
         <w:gridCol w:w="1736"/>
         <w:gridCol w:w="461"/>
         <w:gridCol w:w="576"/>
+        <w:gridCol w:w="353"/>
       </w:tblGrid>
       <w:tr>
         <w:trPr>
@@ -1599,6 +1600,29 @@
             </w:r>
           </w:p>
         </w:tc>
+        <w:tc>
+          <w:tcPr>
+            <w:tcW w:type="dxa" w:w="353"/>
+            <w:vAlign w:val="center"/>
+          </w:tcPr>
+          <w:p>
+            <w:pPr>
+              <w:spacing w:before="0" w:after="0" w:line="240" w:lineRule="auto"/>
+              <w:jc w:val="center"/>
+              <w:rPr>
+                <w:sz w:val="17"/>
+                <w:szCs w:val="17"/>
+              </w:rPr>
+            </w:pPr>
+            <w:r>
+              <w:rPr>
+                <w:b/>
+                <w:sz w:val="17"/>
+              </w:rPr>
+              <w:t>l</w:t>
+            </w:r>
+          </w:p>
+        </w:tc>
       </w:tr>
       <w:tr>
         <w:tc>
@@ -1791,6 +1815,30 @@
             </w:r>
           </w:p>
         </w:tc>
+        <w:tc>
+          <w:tcPr>
+            <w:tcW w:type="dxa" w:w="353"/>
+            <w:noWrap/>
+            <w:vAlign w:val="center"/>
+          </w:tcPr>
+          <w:p>
+            <w:pPr>
+              <w:spacing w:before="0" w:after="0" w:line="240" w:lineRule="auto"/>
+              <w:jc w:val="center"/>
+              <w:rPr>
+                <w:sz w:val="17"/>
+                <w:szCs w:val="17"/>
+              </w:rPr>
+            </w:pPr>
+            <w:r>
+              <w:rPr>
+                <w:b w:val="0"/>
+                <w:sz w:val="17"/>
+              </w:rPr>
+              <w:t>0.5</w:t>
+            </w:r>
+          </w:p>
+        </w:tc>
       </w:tr>
       <w:tr>
         <w:tc>
@@ -1983,6 +2031,30 @@
             </w:r>
           </w:p>
         </w:tc>
+        <w:tc>
+          <w:tcPr>
+            <w:tcW w:type="dxa" w:w="353"/>
+            <w:noWrap/>
+            <w:vAlign w:val="center"/>
+          </w:tcPr>
+          <w:p>
+            <w:pPr>
+              <w:spacing w:before="0" w:after="0" w:line="240" w:lineRule="auto"/>
+              <w:jc w:val="center"/>
+              <w:rPr>
+                <w:sz w:val="17"/>
+                <w:szCs w:val="17"/>
+              </w:rPr>
+            </w:pPr>
+            <w:r>
+              <w:rPr>
+                <w:b w:val="0"/>
+                <w:sz w:val="17"/>
+              </w:rPr>
+              <w:t>0.5</w:t>
+            </w:r>
+          </w:p>
+        </w:tc>
       </w:tr>
       <w:tr>
         <w:tc>
@@ -2172,6 +2244,30 @@
                 <w:sz w:val="17"/>
               </w:rPr>
               <w:t>-1.00</w:t>
+            </w:r>
+          </w:p>
+        </w:tc>
+        <w:tc>
+          <w:tcPr>
+            <w:tcW w:type="dxa" w:w="353"/>
+            <w:noWrap/>
+            <w:vAlign w:val="center"/>
+          </w:tcPr>
+          <w:p>
+            <w:pPr>
+              <w:spacing w:before="0" w:after="0" w:line="240" w:lineRule="auto"/>
+              <w:jc w:val="center"/>
+              <w:rPr>
+                <w:sz w:val="17"/>
+                <w:szCs w:val="17"/>
+              </w:rPr>
+            </w:pPr>
+            <w:r>
+              <w:rPr>
+                <w:b w:val="0"/>
+                <w:sz w:val="17"/>
+              </w:rPr>
+              <w:t>0.5</w:t>
             </w:r>
           </w:p>
         </w:tc>
@@ -2465,7 +2561,7 @@
         <w:keepNext/>
       </w:pPr>
       <w:r>
-        <w:t>The solution converged, closing the boundary inflow against the outflow to within 2.8e-08 ft³/day per ft.</w:t>
+        <w:t>The solution converged, closing the boundary inflow against the outflow to within 1.24e-09 ft³/day per ft.</w:t>
       </w:r>
     </w:p>
     <w:p>
@@ -5117,7 +5213,7 @@
     <w:tbl>
       <w:tblPr>
         <w:tblStyle w:val="TableGrid"/>
-        <w:tblW w:type="dxa" w:w="11043"/>
+        <w:tblW w:type="dxa" w:w="11046"/>
         <w:tblInd w:w="43" w:type="dxa"/>
         <w:tblLayout w:type="fixed"/>
         <w:tblCellMar>
@@ -5139,10 +5235,10 @@
         <w:gridCol w:w="844"/>
         <w:gridCol w:w="581"/>
         <w:gridCol w:w="346"/>
-        <w:gridCol w:w="528"/>
+        <w:gridCol w:w="529"/>
         <w:gridCol w:w="593"/>
-        <w:gridCol w:w="753"/>
-        <w:gridCol w:w="761"/>
+        <w:gridCol w:w="758"/>
+        <w:gridCol w:w="758"/>
         <w:gridCol w:w="691"/>
         <w:gridCol w:w="721"/>
         <w:gridCol w:w="721"/>
@@ -5429,7 +5525,7 @@
         </w:tc>
         <w:tc>
           <w:tcPr>
-            <w:tcW w:type="dxa" w:w="528"/>
+            <w:tcW w:type="dxa" w:w="529"/>
             <w:vAlign w:val="center"/>
           </w:tcPr>
           <w:p>
@@ -5475,7 +5571,7 @@
         </w:tc>
         <w:tc>
           <w:tcPr>
-            <w:tcW w:type="dxa" w:w="753"/>
+            <w:tcW w:type="dxa" w:w="758"/>
             <w:vAlign w:val="center"/>
           </w:tcPr>
           <w:p>
@@ -5498,7 +5594,7 @@
         </w:tc>
         <w:tc>
           <w:tcPr>
-            <w:tcW w:type="dxa" w:w="761"/>
+            <w:tcW w:type="dxa" w:w="758"/>
             <w:vAlign w:val="center"/>
           </w:tcPr>
           <w:p>
@@ -5915,7 +6011,7 @@
         </w:tc>
         <w:tc>
           <w:tcPr>
-            <w:tcW w:type="dxa" w:w="528"/>
+            <w:tcW w:type="dxa" w:w="529"/>
             <w:noWrap/>
             <w:vAlign w:val="center"/>
           </w:tcPr>
@@ -5963,31 +6059,31 @@
         </w:tc>
         <w:tc>
           <w:tcPr>
-            <w:tcW w:type="dxa" w:w="753"/>
-            <w:noWrap/>
-            <w:vAlign w:val="center"/>
-          </w:tcPr>
-          <w:p>
-            <w:pPr>
-              <w:spacing w:before="0" w:after="0" w:line="240" w:lineRule="auto"/>
-              <w:jc w:val="center"/>
-              <w:rPr>
-                <w:sz w:val="14"/>
-                <w:szCs w:val="14"/>
-              </w:rPr>
-            </w:pPr>
-            <w:r>
-              <w:rPr>
-                <w:b w:val="0"/>
-                <w:sz w:val="14"/>
-              </w:rPr>
-              <w:t>9841.7</w:t>
-            </w:r>
-          </w:p>
-        </w:tc>
-        <w:tc>
-          <w:tcPr>
-            <w:tcW w:type="dxa" w:w="761"/>
+            <w:tcW w:type="dxa" w:w="758"/>
+            <w:noWrap/>
+            <w:vAlign w:val="center"/>
+          </w:tcPr>
+          <w:p>
+            <w:pPr>
+              <w:spacing w:before="0" w:after="0" w:line="240" w:lineRule="auto"/>
+              <w:jc w:val="center"/>
+              <w:rPr>
+                <w:sz w:val="14"/>
+                <w:szCs w:val="14"/>
+              </w:rPr>
+            </w:pPr>
+            <w:r>
+              <w:rPr>
+                <w:b w:val="0"/>
+                <w:sz w:val="14"/>
+              </w:rPr>
+              <w:t>9841.8</w:t>
+            </w:r>
+          </w:p>
+        </w:tc>
+        <w:tc>
+          <w:tcPr>
+            <w:tcW w:type="dxa" w:w="758"/>
             <w:noWrap/>
             <w:vAlign w:val="center"/>
           </w:tcPr>
@@ -6077,7 +6173,7 @@
                 <w:b w:val="0"/>
                 <w:sz w:val="14"/>
               </w:rPr>
-              <w:t>-4950.3</w:t>
+              <w:t>-4950.4</w:t>
             </w:r>
           </w:p>
         </w:tc>
@@ -6349,7 +6445,7 @@
         </w:tc>
         <w:tc>
           <w:tcPr>
-            <w:tcW w:type="dxa" w:w="528"/>
+            <w:tcW w:type="dxa" w:w="529"/>
             <w:noWrap/>
             <w:vAlign w:val="center"/>
           </w:tcPr>
@@ -6397,49 +6493,49 @@
         </w:tc>
         <w:tc>
           <w:tcPr>
-            <w:tcW w:type="dxa" w:w="753"/>
-            <w:noWrap/>
-            <w:vAlign w:val="center"/>
-          </w:tcPr>
-          <w:p>
-            <w:pPr>
-              <w:spacing w:before="0" w:after="0" w:line="240" w:lineRule="auto"/>
-              <w:jc w:val="center"/>
-              <w:rPr>
-                <w:sz w:val="14"/>
-                <w:szCs w:val="14"/>
-              </w:rPr>
-            </w:pPr>
-            <w:r>
-              <w:rPr>
-                <w:b w:val="0"/>
-                <w:sz w:val="14"/>
-              </w:rPr>
-              <w:t>10633.5</w:t>
-            </w:r>
-          </w:p>
-        </w:tc>
-        <w:tc>
-          <w:tcPr>
-            <w:tcW w:type="dxa" w:w="761"/>
-            <w:noWrap/>
-            <w:vAlign w:val="center"/>
-          </w:tcPr>
-          <w:p>
-            <w:pPr>
-              <w:spacing w:before="0" w:after="0" w:line="240" w:lineRule="auto"/>
-              <w:jc w:val="center"/>
-              <w:rPr>
-                <w:sz w:val="14"/>
-                <w:szCs w:val="14"/>
-              </w:rPr>
-            </w:pPr>
-            <w:r>
-              <w:rPr>
-                <w:b w:val="0"/>
-                <w:sz w:val="14"/>
-              </w:rPr>
-              <w:t>4950.3</w:t>
+            <w:tcW w:type="dxa" w:w="758"/>
+            <w:noWrap/>
+            <w:vAlign w:val="center"/>
+          </w:tcPr>
+          <w:p>
+            <w:pPr>
+              <w:spacing w:before="0" w:after="0" w:line="240" w:lineRule="auto"/>
+              <w:jc w:val="center"/>
+              <w:rPr>
+                <w:sz w:val="14"/>
+                <w:szCs w:val="14"/>
+              </w:rPr>
+            </w:pPr>
+            <w:r>
+              <w:rPr>
+                <w:b w:val="0"/>
+                <w:sz w:val="14"/>
+              </w:rPr>
+              <w:t>10633.9</w:t>
+            </w:r>
+          </w:p>
+        </w:tc>
+        <w:tc>
+          <w:tcPr>
+            <w:tcW w:type="dxa" w:w="758"/>
+            <w:noWrap/>
+            <w:vAlign w:val="center"/>
+          </w:tcPr>
+          <w:p>
+            <w:pPr>
+              <w:spacing w:before="0" w:after="0" w:line="240" w:lineRule="auto"/>
+              <w:jc w:val="center"/>
+              <w:rPr>
+                <w:sz w:val="14"/>
+                <w:szCs w:val="14"/>
+              </w:rPr>
+            </w:pPr>
+            <w:r>
+              <w:rPr>
+                <w:b w:val="0"/>
+                <w:sz w:val="14"/>
+              </w:rPr>
+              <w:t>4950.4</w:t>
             </w:r>
           </w:p>
         </w:tc>
@@ -6511,7 +6607,7 @@
                 <w:b w:val="0"/>
                 <w:sz w:val="14"/>
               </w:rPr>
-              <w:t>-6975.9</w:t>
+              <w:t>-6975.8</w:t>
             </w:r>
           </w:p>
         </w:tc>
@@ -6753,7 +6849,7 @@
                 <w:b w:val="0"/>
                 <w:sz w:val="14"/>
               </w:rPr>
-              <w:t>326.6</w:t>
+              <w:t>326.4</w:t>
             </w:r>
           </w:p>
         </w:tc>
@@ -6783,7 +6879,7 @@
         </w:tc>
         <w:tc>
           <w:tcPr>
-            <w:tcW w:type="dxa" w:w="528"/>
+            <w:tcW w:type="dxa" w:w="529"/>
             <w:noWrap/>
             <w:vAlign w:val="center"/>
           </w:tcPr>
@@ -6831,31 +6927,31 @@
         </w:tc>
         <w:tc>
           <w:tcPr>
-            <w:tcW w:type="dxa" w:w="753"/>
-            <w:noWrap/>
-            <w:vAlign w:val="center"/>
-          </w:tcPr>
-          <w:p>
-            <w:pPr>
-              <w:spacing w:before="0" w:after="0" w:line="240" w:lineRule="auto"/>
-              <w:jc w:val="center"/>
-              <w:rPr>
-                <w:sz w:val="14"/>
-                <w:szCs w:val="14"/>
-              </w:rPr>
-            </w:pPr>
-            <w:r>
-              <w:rPr>
-                <w:b w:val="0"/>
-                <w:sz w:val="14"/>
-              </w:rPr>
-              <w:t>22126.6</w:t>
-            </w:r>
-          </w:p>
-        </w:tc>
-        <w:tc>
-          <w:tcPr>
-            <w:tcW w:type="dxa" w:w="761"/>
+            <w:tcW w:type="dxa" w:w="758"/>
+            <w:noWrap/>
+            <w:vAlign w:val="center"/>
+          </w:tcPr>
+          <w:p>
+            <w:pPr>
+              <w:spacing w:before="0" w:after="0" w:line="240" w:lineRule="auto"/>
+              <w:jc w:val="center"/>
+              <w:rPr>
+                <w:sz w:val="14"/>
+                <w:szCs w:val="14"/>
+              </w:rPr>
+            </w:pPr>
+            <w:r>
+              <w:rPr>
+                <w:b w:val="0"/>
+                <w:sz w:val="14"/>
+              </w:rPr>
+              <w:t>22128.6</w:t>
+            </w:r>
+          </w:p>
+        </w:tc>
+        <w:tc>
+          <w:tcPr>
+            <w:tcW w:type="dxa" w:w="758"/>
             <w:noWrap/>
             <w:vAlign w:val="center"/>
           </w:tcPr>
@@ -6945,7 +7041,7 @@
                 <w:b w:val="0"/>
                 <w:sz w:val="14"/>
               </w:rPr>
-              <w:t>-15066.3</w:t>
+              <w:t>-15065.8</w:t>
             </w:r>
           </w:p>
         </w:tc>
@@ -7187,7 +7283,7 @@
                 <w:b w:val="0"/>
                 <w:sz w:val="14"/>
               </w:rPr>
-              <w:t>482.8</w:t>
+              <w:t>482.4</w:t>
             </w:r>
           </w:p>
         </w:tc>
@@ -7217,7 +7313,7 @@
         </w:tc>
         <w:tc>
           <w:tcPr>
-            <w:tcW w:type="dxa" w:w="528"/>
+            <w:tcW w:type="dxa" w:w="529"/>
             <w:noWrap/>
             <w:vAlign w:val="center"/>
           </w:tcPr>
@@ -7265,49 +7361,49 @@
         </w:tc>
         <w:tc>
           <w:tcPr>
-            <w:tcW w:type="dxa" w:w="753"/>
-            <w:noWrap/>
-            <w:vAlign w:val="center"/>
-          </w:tcPr>
-          <w:p>
-            <w:pPr>
-              <w:spacing w:before="0" w:after="0" w:line="240" w:lineRule="auto"/>
-              <w:jc w:val="center"/>
-              <w:rPr>
-                <w:sz w:val="14"/>
-                <w:szCs w:val="14"/>
-              </w:rPr>
-            </w:pPr>
-            <w:r>
-              <w:rPr>
-                <w:b w:val="0"/>
-                <w:sz w:val="14"/>
-              </w:rPr>
-              <w:t>27196.6</w:t>
-            </w:r>
-          </w:p>
-        </w:tc>
-        <w:tc>
-          <w:tcPr>
-            <w:tcW w:type="dxa" w:w="761"/>
-            <w:noWrap/>
-            <w:vAlign w:val="center"/>
-          </w:tcPr>
-          <w:p>
-            <w:pPr>
-              <w:spacing w:before="0" w:after="0" w:line="240" w:lineRule="auto"/>
-              <w:jc w:val="center"/>
-              <w:rPr>
-                <w:sz w:val="14"/>
-                <w:szCs w:val="14"/>
-              </w:rPr>
-            </w:pPr>
-            <w:r>
-              <w:rPr>
-                <w:b w:val="0"/>
-                <w:sz w:val="14"/>
-              </w:rPr>
-              <w:t>26992.5</w:t>
+            <w:tcW w:type="dxa" w:w="758"/>
+            <w:noWrap/>
+            <w:vAlign w:val="center"/>
+          </w:tcPr>
+          <w:p>
+            <w:pPr>
+              <w:spacing w:before="0" w:after="0" w:line="240" w:lineRule="auto"/>
+              <w:jc w:val="center"/>
+              <w:rPr>
+                <w:sz w:val="14"/>
+                <w:szCs w:val="14"/>
+              </w:rPr>
+            </w:pPr>
+            <w:r>
+              <w:rPr>
+                <w:b w:val="0"/>
+                <w:sz w:val="14"/>
+              </w:rPr>
+              <w:t>27199.8</w:t>
+            </w:r>
+          </w:p>
+        </w:tc>
+        <w:tc>
+          <w:tcPr>
+            <w:tcW w:type="dxa" w:w="758"/>
+            <w:noWrap/>
+            <w:vAlign w:val="center"/>
+          </w:tcPr>
+          <w:p>
+            <w:pPr>
+              <w:spacing w:before="0" w:after="0" w:line="240" w:lineRule="auto"/>
+              <w:jc w:val="center"/>
+              <w:rPr>
+                <w:sz w:val="14"/>
+                <w:szCs w:val="14"/>
+              </w:rPr>
+            </w:pPr>
+            <w:r>
+              <w:rPr>
+                <w:b w:val="0"/>
+                <w:sz w:val="14"/>
+              </w:rPr>
+              <w:t>26992.0</w:t>
             </w:r>
           </w:p>
         </w:tc>
@@ -7379,7 +7475,7 @@
                 <w:b w:val="0"/>
                 <w:sz w:val="14"/>
               </w:rPr>
-              <w:t>-17949.9</w:t>
+              <w:t>-17949.1</w:t>
             </w:r>
           </w:p>
         </w:tc>
@@ -7621,7 +7717,7 @@
                 <w:b w:val="0"/>
                 <w:sz w:val="14"/>
               </w:rPr>
-              <w:t>594.4</w:t>
+              <w:t>593.9</w:t>
             </w:r>
           </w:p>
         </w:tc>
@@ -7651,7 +7747,7 @@
         </w:tc>
         <w:tc>
           <w:tcPr>
-            <w:tcW w:type="dxa" w:w="528"/>
+            <w:tcW w:type="dxa" w:w="529"/>
             <w:noWrap/>
             <w:vAlign w:val="center"/>
           </w:tcPr>
@@ -7699,49 +7795,49 @@
         </w:tc>
         <w:tc>
           <w:tcPr>
-            <w:tcW w:type="dxa" w:w="753"/>
-            <w:noWrap/>
-            <w:vAlign w:val="center"/>
-          </w:tcPr>
-          <w:p>
-            <w:pPr>
-              <w:spacing w:before="0" w:after="0" w:line="240" w:lineRule="auto"/>
-              <w:jc w:val="center"/>
-              <w:rPr>
-                <w:sz w:val="14"/>
-                <w:szCs w:val="14"/>
-              </w:rPr>
-            </w:pPr>
-            <w:r>
-              <w:rPr>
-                <w:b w:val="0"/>
-                <w:sz w:val="14"/>
-              </w:rPr>
-              <w:t>31912.2</w:t>
-            </w:r>
-          </w:p>
-        </w:tc>
-        <w:tc>
-          <w:tcPr>
-            <w:tcW w:type="dxa" w:w="761"/>
-            <w:noWrap/>
-            <w:vAlign w:val="center"/>
-          </w:tcPr>
-          <w:p>
-            <w:pPr>
-              <w:spacing w:before="0" w:after="0" w:line="240" w:lineRule="auto"/>
-              <w:jc w:val="center"/>
-              <w:rPr>
-                <w:sz w:val="14"/>
-                <w:szCs w:val="14"/>
-              </w:rPr>
-            </w:pPr>
-            <w:r>
-              <w:rPr>
-                <w:b w:val="0"/>
-                <w:sz w:val="14"/>
-              </w:rPr>
-              <w:t>44942.4</w:t>
+            <w:tcW w:type="dxa" w:w="758"/>
+            <w:noWrap/>
+            <w:vAlign w:val="center"/>
+          </w:tcPr>
+          <w:p>
+            <w:pPr>
+              <w:spacing w:before="0" w:after="0" w:line="240" w:lineRule="auto"/>
+              <w:jc w:val="center"/>
+              <w:rPr>
+                <w:sz w:val="14"/>
+                <w:szCs w:val="14"/>
+              </w:rPr>
+            </w:pPr>
+            <w:r>
+              <w:rPr>
+                <w:b w:val="0"/>
+                <w:sz w:val="14"/>
+              </w:rPr>
+              <w:t>31916.2</w:t>
+            </w:r>
+          </w:p>
+        </w:tc>
+        <w:tc>
+          <w:tcPr>
+            <w:tcW w:type="dxa" w:w="758"/>
+            <w:noWrap/>
+            <w:vAlign w:val="center"/>
+          </w:tcPr>
+          <w:p>
+            <w:pPr>
+              <w:spacing w:before="0" w:after="0" w:line="240" w:lineRule="auto"/>
+              <w:jc w:val="center"/>
+              <w:rPr>
+                <w:sz w:val="14"/>
+                <w:szCs w:val="14"/>
+              </w:rPr>
+            </w:pPr>
+            <w:r>
+              <w:rPr>
+                <w:b w:val="0"/>
+                <w:sz w:val="14"/>
+              </w:rPr>
+              <w:t>44941.1</w:t>
             </w:r>
           </w:p>
         </w:tc>
@@ -7813,7 +7909,7 @@
                 <w:b w:val="0"/>
                 <w:sz w:val="14"/>
               </w:rPr>
-              <w:t>-19670.7</w:t>
+              <w:t>-19669.7</w:t>
             </w:r>
           </w:p>
         </w:tc>
@@ -8055,7 +8151,7 @@
                 <w:b w:val="0"/>
                 <w:sz w:val="14"/>
               </w:rPr>
-              <w:t>655.7</w:t>
+              <w:t>655.3</w:t>
             </w:r>
           </w:p>
         </w:tc>
@@ -8085,7 +8181,7 @@
         </w:tc>
         <w:tc>
           <w:tcPr>
-            <w:tcW w:type="dxa" w:w="528"/>
+            <w:tcW w:type="dxa" w:w="529"/>
             <w:noWrap/>
             <w:vAlign w:val="center"/>
           </w:tcPr>
@@ -8133,49 +8229,49 @@
         </w:tc>
         <w:tc>
           <w:tcPr>
-            <w:tcW w:type="dxa" w:w="753"/>
-            <w:noWrap/>
-            <w:vAlign w:val="center"/>
-          </w:tcPr>
-          <w:p>
-            <w:pPr>
-              <w:spacing w:before="0" w:after="0" w:line="240" w:lineRule="auto"/>
-              <w:jc w:val="center"/>
-              <w:rPr>
-                <w:sz w:val="14"/>
-                <w:szCs w:val="14"/>
-              </w:rPr>
-            </w:pPr>
-            <w:r>
-              <w:rPr>
-                <w:b w:val="0"/>
-                <w:sz w:val="14"/>
-              </w:rPr>
-              <w:t>35330.0</w:t>
-            </w:r>
-          </w:p>
-        </w:tc>
-        <w:tc>
-          <w:tcPr>
-            <w:tcW w:type="dxa" w:w="761"/>
-            <w:noWrap/>
-            <w:vAlign w:val="center"/>
-          </w:tcPr>
-          <w:p>
-            <w:pPr>
-              <w:spacing w:before="0" w:after="0" w:line="240" w:lineRule="auto"/>
-              <w:jc w:val="center"/>
-              <w:rPr>
-                <w:sz w:val="14"/>
-                <w:szCs w:val="14"/>
-              </w:rPr>
-            </w:pPr>
-            <w:r>
-              <w:rPr>
-                <w:b w:val="0"/>
-                <w:sz w:val="14"/>
-              </w:rPr>
-              <w:t>64613.1</w:t>
+            <w:tcW w:type="dxa" w:w="758"/>
+            <w:noWrap/>
+            <w:vAlign w:val="center"/>
+          </w:tcPr>
+          <w:p>
+            <w:pPr>
+              <w:spacing w:before="0" w:after="0" w:line="240" w:lineRule="auto"/>
+              <w:jc w:val="center"/>
+              <w:rPr>
+                <w:sz w:val="14"/>
+                <w:szCs w:val="14"/>
+              </w:rPr>
+            </w:pPr>
+            <w:r>
+              <w:rPr>
+                <w:b w:val="0"/>
+                <w:sz w:val="14"/>
+              </w:rPr>
+              <w:t>35333.8</w:t>
+            </w:r>
+          </w:p>
+        </w:tc>
+        <w:tc>
+          <w:tcPr>
+            <w:tcW w:type="dxa" w:w="758"/>
+            <w:noWrap/>
+            <w:vAlign w:val="center"/>
+          </w:tcPr>
+          <w:p>
+            <w:pPr>
+              <w:spacing w:before="0" w:after="0" w:line="240" w:lineRule="auto"/>
+              <w:jc w:val="center"/>
+              <w:rPr>
+                <w:sz w:val="14"/>
+                <w:szCs w:val="14"/>
+              </w:rPr>
+            </w:pPr>
+            <w:r>
+              <w:rPr>
+                <w:b w:val="0"/>
+                <w:sz w:val="14"/>
+              </w:rPr>
+              <w:t>64610.9</w:t>
             </w:r>
           </w:p>
         </w:tc>
@@ -8247,7 +8343,7 @@
                 <w:b w:val="0"/>
                 <w:sz w:val="14"/>
               </w:rPr>
-              <w:t>-19903.1</w:t>
+              <w:t>-19902.2</w:t>
             </w:r>
           </w:p>
         </w:tc>
@@ -8489,7 +8585,7 @@
                 <w:b w:val="0"/>
                 <w:sz w:val="14"/>
               </w:rPr>
-              <w:t>673.1</w:t>
+              <w:t>672.6</w:t>
             </w:r>
           </w:p>
         </w:tc>
@@ -8519,7 +8615,7 @@
         </w:tc>
         <w:tc>
           <w:tcPr>
-            <w:tcW w:type="dxa" w:w="528"/>
+            <w:tcW w:type="dxa" w:w="529"/>
             <w:noWrap/>
             <w:vAlign w:val="center"/>
           </w:tcPr>
@@ -8567,49 +8663,49 @@
         </w:tc>
         <w:tc>
           <w:tcPr>
-            <w:tcW w:type="dxa" w:w="753"/>
-            <w:noWrap/>
-            <w:vAlign w:val="center"/>
-          </w:tcPr>
-          <w:p>
-            <w:pPr>
-              <w:spacing w:before="0" w:after="0" w:line="240" w:lineRule="auto"/>
-              <w:jc w:val="center"/>
-              <w:rPr>
-                <w:sz w:val="14"/>
-                <w:szCs w:val="14"/>
-              </w:rPr>
-            </w:pPr>
-            <w:r>
-              <w:rPr>
-                <w:b w:val="0"/>
-                <w:sz w:val="14"/>
-              </w:rPr>
-              <w:t>37520.5</w:t>
-            </w:r>
-          </w:p>
-        </w:tc>
-        <w:tc>
-          <w:tcPr>
-            <w:tcW w:type="dxa" w:w="761"/>
-            <w:noWrap/>
-            <w:vAlign w:val="center"/>
-          </w:tcPr>
-          <w:p>
-            <w:pPr>
-              <w:spacing w:before="0" w:after="0" w:line="240" w:lineRule="auto"/>
-              <w:jc w:val="center"/>
-              <w:rPr>
-                <w:sz w:val="14"/>
-                <w:szCs w:val="14"/>
-              </w:rPr>
-            </w:pPr>
-            <w:r>
-              <w:rPr>
-                <w:b w:val="0"/>
-                <w:sz w:val="14"/>
-              </w:rPr>
-              <w:t>84516.2</w:t>
+            <w:tcW w:type="dxa" w:w="758"/>
+            <w:noWrap/>
+            <w:vAlign w:val="center"/>
+          </w:tcPr>
+          <w:p>
+            <w:pPr>
+              <w:spacing w:before="0" w:after="0" w:line="240" w:lineRule="auto"/>
+              <w:jc w:val="center"/>
+              <w:rPr>
+                <w:sz w:val="14"/>
+                <w:szCs w:val="14"/>
+              </w:rPr>
+            </w:pPr>
+            <w:r>
+              <w:rPr>
+                <w:b w:val="0"/>
+                <w:sz w:val="14"/>
+              </w:rPr>
+              <w:t>37524.2</w:t>
+            </w:r>
+          </w:p>
+        </w:tc>
+        <w:tc>
+          <w:tcPr>
+            <w:tcW w:type="dxa" w:w="758"/>
+            <w:noWrap/>
+            <w:vAlign w:val="center"/>
+          </w:tcPr>
+          <w:p>
+            <w:pPr>
+              <w:spacing w:before="0" w:after="0" w:line="240" w:lineRule="auto"/>
+              <w:jc w:val="center"/>
+              <w:rPr>
+                <w:sz w:val="14"/>
+                <w:szCs w:val="14"/>
+              </w:rPr>
+            </w:pPr>
+            <w:r>
+              <w:rPr>
+                <w:b w:val="0"/>
+                <w:sz w:val="14"/>
+              </w:rPr>
+              <w:t>84513.0</w:t>
             </w:r>
           </w:p>
         </w:tc>
@@ -8681,7 +8777,7 @@
                 <w:b w:val="0"/>
                 <w:sz w:val="14"/>
               </w:rPr>
-              <w:t>-19006.8</w:t>
+              <w:t>-19005.9</w:t>
             </w:r>
           </w:p>
         </w:tc>
@@ -8923,7 +9019,7 @@
                 <w:b w:val="0"/>
                 <w:sz w:val="14"/>
               </w:rPr>
-              <w:t>663.4</w:t>
+              <w:t>663.1</w:t>
             </w:r>
           </w:p>
         </w:tc>
@@ -8953,7 +9049,7 @@
         </w:tc>
         <w:tc>
           <w:tcPr>
-            <w:tcW w:type="dxa" w:w="528"/>
+            <w:tcW w:type="dxa" w:w="529"/>
             <w:noWrap/>
             <w:vAlign w:val="center"/>
           </w:tcPr>
@@ -9001,49 +9097,49 @@
         </w:tc>
         <w:tc>
           <w:tcPr>
-            <w:tcW w:type="dxa" w:w="753"/>
-            <w:noWrap/>
-            <w:vAlign w:val="center"/>
-          </w:tcPr>
-          <w:p>
-            <w:pPr>
-              <w:spacing w:before="0" w:after="0" w:line="240" w:lineRule="auto"/>
-              <w:jc w:val="center"/>
-              <w:rPr>
-                <w:sz w:val="14"/>
-                <w:szCs w:val="14"/>
-              </w:rPr>
-            </w:pPr>
-            <w:r>
-              <w:rPr>
-                <w:b w:val="0"/>
-                <w:sz w:val="14"/>
-              </w:rPr>
-              <w:t>39537.7</w:t>
-            </w:r>
-          </w:p>
-        </w:tc>
-        <w:tc>
-          <w:tcPr>
-            <w:tcW w:type="dxa" w:w="761"/>
-            <w:noWrap/>
-            <w:vAlign w:val="center"/>
-          </w:tcPr>
-          <w:p>
-            <w:pPr>
-              <w:spacing w:before="0" w:after="0" w:line="240" w:lineRule="auto"/>
-              <w:jc w:val="center"/>
-              <w:rPr>
-                <w:sz w:val="14"/>
-                <w:szCs w:val="14"/>
-              </w:rPr>
-            </w:pPr>
-            <w:r>
-              <w:rPr>
-                <w:b w:val="0"/>
-                <w:sz w:val="14"/>
-              </w:rPr>
-              <w:t>103523.0</w:t>
+            <w:tcW w:type="dxa" w:w="758"/>
+            <w:noWrap/>
+            <w:vAlign w:val="center"/>
+          </w:tcPr>
+          <w:p>
+            <w:pPr>
+              <w:spacing w:before="0" w:after="0" w:line="240" w:lineRule="auto"/>
+              <w:jc w:val="center"/>
+              <w:rPr>
+                <w:sz w:val="14"/>
+                <w:szCs w:val="14"/>
+              </w:rPr>
+            </w:pPr>
+            <w:r>
+              <w:rPr>
+                <w:b w:val="0"/>
+                <w:sz w:val="14"/>
+              </w:rPr>
+              <w:t>39540.1</w:t>
+            </w:r>
+          </w:p>
+        </w:tc>
+        <w:tc>
+          <w:tcPr>
+            <w:tcW w:type="dxa" w:w="758"/>
+            <w:noWrap/>
+            <w:vAlign w:val="center"/>
+          </w:tcPr>
+          <w:p>
+            <w:pPr>
+              <w:spacing w:before="0" w:after="0" w:line="240" w:lineRule="auto"/>
+              <w:jc w:val="center"/>
+              <w:rPr>
+                <w:sz w:val="14"/>
+                <w:szCs w:val="14"/>
+              </w:rPr>
+            </w:pPr>
+            <w:r>
+              <w:rPr>
+                <w:b w:val="0"/>
+                <w:sz w:val="14"/>
+              </w:rPr>
+              <w:t>103519.0</w:t>
             </w:r>
           </w:p>
         </w:tc>
@@ -9115,7 +9211,7 @@
                 <w:b w:val="0"/>
                 <w:sz w:val="14"/>
               </w:rPr>
-              <w:t>-17749.7</w:t>
+              <w:t>-17749.2</w:t>
             </w:r>
           </w:p>
         </w:tc>
@@ -9357,7 +9453,7 @@
                 <w:b w:val="0"/>
                 <w:sz w:val="14"/>
               </w:rPr>
-              <w:t>651.0</w:t>
+              <w:t>650.8</w:t>
             </w:r>
           </w:p>
         </w:tc>
@@ -9387,7 +9483,7 @@
         </w:tc>
         <w:tc>
           <w:tcPr>
-            <w:tcW w:type="dxa" w:w="528"/>
+            <w:tcW w:type="dxa" w:w="529"/>
             <w:noWrap/>
             <w:vAlign w:val="center"/>
           </w:tcPr>
@@ -9435,49 +9531,49 @@
         </w:tc>
         <w:tc>
           <w:tcPr>
-            <w:tcW w:type="dxa" w:w="753"/>
-            <w:noWrap/>
-            <w:vAlign w:val="center"/>
-          </w:tcPr>
-          <w:p>
-            <w:pPr>
-              <w:spacing w:before="0" w:after="0" w:line="240" w:lineRule="auto"/>
-              <w:jc w:val="center"/>
-              <w:rPr>
-                <w:sz w:val="14"/>
-                <w:szCs w:val="14"/>
-              </w:rPr>
-            </w:pPr>
-            <w:r>
-              <w:rPr>
-                <w:b w:val="0"/>
-                <w:sz w:val="14"/>
-              </w:rPr>
-              <w:t>41247.0</w:t>
-            </w:r>
-          </w:p>
-        </w:tc>
-        <w:tc>
-          <w:tcPr>
-            <w:tcW w:type="dxa" w:w="761"/>
-            <w:noWrap/>
-            <w:vAlign w:val="center"/>
-          </w:tcPr>
-          <w:p>
-            <w:pPr>
-              <w:spacing w:before="0" w:after="0" w:line="240" w:lineRule="auto"/>
-              <w:jc w:val="center"/>
-              <w:rPr>
-                <w:sz w:val="14"/>
-                <w:szCs w:val="14"/>
-              </w:rPr>
-            </w:pPr>
-            <w:r>
-              <w:rPr>
-                <w:b w:val="0"/>
-                <w:sz w:val="14"/>
-              </w:rPr>
-              <w:t>121272.7</w:t>
+            <w:tcW w:type="dxa" w:w="758"/>
+            <w:noWrap/>
+            <w:vAlign w:val="center"/>
+          </w:tcPr>
+          <w:p>
+            <w:pPr>
+              <w:spacing w:before="0" w:after="0" w:line="240" w:lineRule="auto"/>
+              <w:jc w:val="center"/>
+              <w:rPr>
+                <w:sz w:val="14"/>
+                <w:szCs w:val="14"/>
+              </w:rPr>
+            </w:pPr>
+            <w:r>
+              <w:rPr>
+                <w:b w:val="0"/>
+                <w:sz w:val="14"/>
+              </w:rPr>
+              <w:t>41248.2</w:t>
+            </w:r>
+          </w:p>
+        </w:tc>
+        <w:tc>
+          <w:tcPr>
+            <w:tcW w:type="dxa" w:w="758"/>
+            <w:noWrap/>
+            <w:vAlign w:val="center"/>
+          </w:tcPr>
+          <w:p>
+            <w:pPr>
+              <w:spacing w:before="0" w:after="0" w:line="240" w:lineRule="auto"/>
+              <w:jc w:val="center"/>
+              <w:rPr>
+                <w:sz w:val="14"/>
+                <w:szCs w:val="14"/>
+              </w:rPr>
+            </w:pPr>
+            <w:r>
+              <w:rPr>
+                <w:b w:val="0"/>
+                <w:sz w:val="14"/>
+              </w:rPr>
+              <w:t>121268.2</w:t>
             </w:r>
           </w:p>
         </w:tc>
@@ -9549,7 +9645,7 @@
                 <w:b w:val="0"/>
                 <w:sz w:val="14"/>
               </w:rPr>
-              <w:t>-16254.9</w:t>
+              <w:t>-16254.7</w:t>
             </w:r>
           </w:p>
         </w:tc>
@@ -9821,7 +9917,7 @@
         </w:tc>
         <w:tc>
           <w:tcPr>
-            <w:tcW w:type="dxa" w:w="528"/>
+            <w:tcW w:type="dxa" w:w="529"/>
             <w:noWrap/>
             <w:vAlign w:val="center"/>
           </w:tcPr>
@@ -9869,49 +9965,49 @@
         </w:tc>
         <w:tc>
           <w:tcPr>
-            <w:tcW w:type="dxa" w:w="753"/>
-            <w:noWrap/>
-            <w:vAlign w:val="center"/>
-          </w:tcPr>
-          <w:p>
-            <w:pPr>
-              <w:spacing w:before="0" w:after="0" w:line="240" w:lineRule="auto"/>
-              <w:jc w:val="center"/>
-              <w:rPr>
-                <w:sz w:val="14"/>
-                <w:szCs w:val="14"/>
-              </w:rPr>
-            </w:pPr>
-            <w:r>
-              <w:rPr>
-                <w:b w:val="0"/>
-                <w:sz w:val="14"/>
-              </w:rPr>
-              <w:t>42387.5</w:t>
-            </w:r>
-          </w:p>
-        </w:tc>
-        <w:tc>
-          <w:tcPr>
-            <w:tcW w:type="dxa" w:w="761"/>
-            <w:noWrap/>
-            <w:vAlign w:val="center"/>
-          </w:tcPr>
-          <w:p>
-            <w:pPr>
-              <w:spacing w:before="0" w:after="0" w:line="240" w:lineRule="auto"/>
-              <w:jc w:val="center"/>
-              <w:rPr>
-                <w:sz w:val="14"/>
-                <w:szCs w:val="14"/>
-              </w:rPr>
-            </w:pPr>
-            <w:r>
-              <w:rPr>
-                <w:b w:val="0"/>
-                <w:sz w:val="14"/>
-              </w:rPr>
-              <w:t>137527.5</w:t>
+            <w:tcW w:type="dxa" w:w="758"/>
+            <w:noWrap/>
+            <w:vAlign w:val="center"/>
+          </w:tcPr>
+          <w:p>
+            <w:pPr>
+              <w:spacing w:before="0" w:after="0" w:line="240" w:lineRule="auto"/>
+              <w:jc w:val="center"/>
+              <w:rPr>
+                <w:sz w:val="14"/>
+                <w:szCs w:val="14"/>
+              </w:rPr>
+            </w:pPr>
+            <w:r>
+              <w:rPr>
+                <w:b w:val="0"/>
+                <w:sz w:val="14"/>
+              </w:rPr>
+              <w:t>42387.9</w:t>
+            </w:r>
+          </w:p>
+        </w:tc>
+        <w:tc>
+          <w:tcPr>
+            <w:tcW w:type="dxa" w:w="758"/>
+            <w:noWrap/>
+            <w:vAlign w:val="center"/>
+          </w:tcPr>
+          <w:p>
+            <w:pPr>
+              <w:spacing w:before="0" w:after="0" w:line="240" w:lineRule="auto"/>
+              <w:jc w:val="center"/>
+              <w:rPr>
+                <w:sz w:val="14"/>
+                <w:szCs w:val="14"/>
+              </w:rPr>
+            </w:pPr>
+            <w:r>
+              <w:rPr>
+                <w:b w:val="0"/>
+                <w:sz w:val="14"/>
+              </w:rPr>
+              <w:t>137522.9</w:t>
             </w:r>
           </w:p>
         </w:tc>
@@ -9983,7 +10079,7 @@
                 <w:b w:val="0"/>
                 <w:sz w:val="14"/>
               </w:rPr>
-              <w:t>-14656.4</w:t>
+              <w:t>-14656.5</w:t>
             </w:r>
           </w:p>
         </w:tc>
@@ -10255,7 +10351,7 @@
         </w:tc>
         <w:tc>
           <w:tcPr>
-            <w:tcW w:type="dxa" w:w="528"/>
+            <w:tcW w:type="dxa" w:w="529"/>
             <w:noWrap/>
             <w:vAlign w:val="center"/>
           </w:tcPr>
@@ -10303,7 +10399,7 @@
         </w:tc>
         <w:tc>
           <w:tcPr>
-            <w:tcW w:type="dxa" w:w="753"/>
+            <w:tcW w:type="dxa" w:w="758"/>
             <w:noWrap/>
             <w:vAlign w:val="center"/>
           </w:tcPr>
@@ -10327,25 +10423,25 @@
         </w:tc>
         <w:tc>
           <w:tcPr>
-            <w:tcW w:type="dxa" w:w="761"/>
-            <w:noWrap/>
-            <w:vAlign w:val="center"/>
-          </w:tcPr>
-          <w:p>
-            <w:pPr>
-              <w:spacing w:before="0" w:after="0" w:line="240" w:lineRule="auto"/>
-              <w:jc w:val="center"/>
-              <w:rPr>
-                <w:sz w:val="14"/>
-                <w:szCs w:val="14"/>
-              </w:rPr>
-            </w:pPr>
-            <w:r>
-              <w:rPr>
-                <w:b w:val="0"/>
-                <w:sz w:val="14"/>
-              </w:rPr>
-              <w:t>152183.9</w:t>
+            <w:tcW w:type="dxa" w:w="758"/>
+            <w:noWrap/>
+            <w:vAlign w:val="center"/>
+          </w:tcPr>
+          <w:p>
+            <w:pPr>
+              <w:spacing w:before="0" w:after="0" w:line="240" w:lineRule="auto"/>
+              <w:jc w:val="center"/>
+              <w:rPr>
+                <w:sz w:val="14"/>
+                <w:szCs w:val="14"/>
+              </w:rPr>
+            </w:pPr>
+            <w:r>
+              <w:rPr>
+                <w:b w:val="0"/>
+                <w:sz w:val="14"/>
+              </w:rPr>
+              <w:t>152179.4</w:t>
             </w:r>
           </w:p>
         </w:tc>
@@ -10417,7 +10513,7 @@
                 <w:b w:val="0"/>
                 <w:sz w:val="14"/>
               </w:rPr>
-              <w:t>-13047.7</w:t>
+              <w:t>-13047.9</w:t>
             </w:r>
           </w:p>
         </w:tc>
@@ -10689,7 +10785,7 @@
         </w:tc>
         <w:tc>
           <w:tcPr>
-            <w:tcW w:type="dxa" w:w="528"/>
+            <w:tcW w:type="dxa" w:w="529"/>
             <w:noWrap/>
             <w:vAlign w:val="center"/>
           </w:tcPr>
@@ -10737,7 +10833,7 @@
         </w:tc>
         <w:tc>
           <w:tcPr>
-            <w:tcW w:type="dxa" w:w="753"/>
+            <w:tcW w:type="dxa" w:w="758"/>
             <w:noWrap/>
             <w:vAlign w:val="center"/>
           </w:tcPr>
@@ -10761,25 +10857,25 @@
         </w:tc>
         <w:tc>
           <w:tcPr>
-            <w:tcW w:type="dxa" w:w="761"/>
-            <w:noWrap/>
-            <w:vAlign w:val="center"/>
-          </w:tcPr>
-          <w:p>
-            <w:pPr>
-              <w:spacing w:before="0" w:after="0" w:line="240" w:lineRule="auto"/>
-              <w:jc w:val="center"/>
-              <w:rPr>
-                <w:sz w:val="14"/>
-                <w:szCs w:val="14"/>
-              </w:rPr>
-            </w:pPr>
-            <w:r>
-              <w:rPr>
-                <w:b w:val="0"/>
-                <w:sz w:val="14"/>
-              </w:rPr>
-              <w:t>165231.6</w:t>
+            <w:tcW w:type="dxa" w:w="758"/>
+            <w:noWrap/>
+            <w:vAlign w:val="center"/>
+          </w:tcPr>
+          <w:p>
+            <w:pPr>
+              <w:spacing w:before="0" w:after="0" w:line="240" w:lineRule="auto"/>
+              <w:jc w:val="center"/>
+              <w:rPr>
+                <w:sz w:val="14"/>
+                <w:szCs w:val="14"/>
+              </w:rPr>
+            </w:pPr>
+            <w:r>
+              <w:rPr>
+                <w:b w:val="0"/>
+                <w:sz w:val="14"/>
+              </w:rPr>
+              <w:t>165227.2</w:t>
             </w:r>
           </w:p>
         </w:tc>
@@ -10851,7 +10947,7 @@
                 <w:b w:val="0"/>
                 <w:sz w:val="14"/>
               </w:rPr>
-              <w:t>-6884.2</w:t>
+              <w:t>-6884.4</w:t>
             </w:r>
           </w:p>
         </w:tc>
@@ -11093,7 +11189,7 @@
                 <w:b w:val="0"/>
                 <w:sz w:val="14"/>
               </w:rPr>
-              <w:t>1174.9</w:t>
+              <w:t>1175.0</w:t>
             </w:r>
           </w:p>
         </w:tc>
@@ -11123,7 +11219,7 @@
         </w:tc>
         <w:tc>
           <w:tcPr>
-            <w:tcW w:type="dxa" w:w="528"/>
+            <w:tcW w:type="dxa" w:w="529"/>
             <w:noWrap/>
             <w:vAlign w:val="center"/>
           </w:tcPr>
@@ -11171,7 +11267,7 @@
         </w:tc>
         <w:tc>
           <w:tcPr>
-            <w:tcW w:type="dxa" w:w="753"/>
+            <w:tcW w:type="dxa" w:w="758"/>
             <w:noWrap/>
             <w:vAlign w:val="center"/>
           </w:tcPr>
@@ -11195,25 +11291,25 @@
         </w:tc>
         <w:tc>
           <w:tcPr>
-            <w:tcW w:type="dxa" w:w="761"/>
-            <w:noWrap/>
-            <w:vAlign w:val="center"/>
-          </w:tcPr>
-          <w:p>
-            <w:pPr>
-              <w:spacing w:before="0" w:after="0" w:line="240" w:lineRule="auto"/>
-              <w:jc w:val="center"/>
-              <w:rPr>
-                <w:sz w:val="14"/>
-                <w:szCs w:val="14"/>
-              </w:rPr>
-            </w:pPr>
-            <w:r>
-              <w:rPr>
-                <w:b w:val="0"/>
-                <w:sz w:val="14"/>
-              </w:rPr>
-              <w:t>172115.9</w:t>
+            <w:tcW w:type="dxa" w:w="758"/>
+            <w:noWrap/>
+            <w:vAlign w:val="center"/>
+          </w:tcPr>
+          <w:p>
+            <w:pPr>
+              <w:spacing w:before="0" w:after="0" w:line="240" w:lineRule="auto"/>
+              <w:jc w:val="center"/>
+              <w:rPr>
+                <w:sz w:val="14"/>
+                <w:szCs w:val="14"/>
+              </w:rPr>
+            </w:pPr>
+            <w:r>
+              <w:rPr>
+                <w:b w:val="0"/>
+                <w:sz w:val="14"/>
+              </w:rPr>
+              <w:t>172111.7</w:t>
             </w:r>
           </w:p>
         </w:tc>
@@ -11285,7 +11381,7 @@
                 <w:b w:val="0"/>
                 <w:sz w:val="14"/>
               </w:rPr>
-              <w:t>-5565.6</w:t>
+              <w:t>-5565.8</w:t>
             </w:r>
           </w:p>
         </w:tc>
@@ -11557,7 +11653,7 @@
         </w:tc>
         <w:tc>
           <w:tcPr>
-            <w:tcW w:type="dxa" w:w="528"/>
+            <w:tcW w:type="dxa" w:w="529"/>
             <w:noWrap/>
             <w:vAlign w:val="center"/>
           </w:tcPr>
@@ -11605,49 +11701,49 @@
         </w:tc>
         <w:tc>
           <w:tcPr>
-            <w:tcW w:type="dxa" w:w="753"/>
-            <w:noWrap/>
-            <w:vAlign w:val="center"/>
-          </w:tcPr>
-          <w:p>
-            <w:pPr>
-              <w:spacing w:before="0" w:after="0" w:line="240" w:lineRule="auto"/>
-              <w:jc w:val="center"/>
-              <w:rPr>
-                <w:sz w:val="14"/>
-                <w:szCs w:val="14"/>
-              </w:rPr>
-            </w:pPr>
-            <w:r>
-              <w:rPr>
-                <w:b w:val="0"/>
-                <w:sz w:val="14"/>
-              </w:rPr>
-              <w:t>36684.2</w:t>
-            </w:r>
-          </w:p>
-        </w:tc>
-        <w:tc>
-          <w:tcPr>
-            <w:tcW w:type="dxa" w:w="761"/>
-            <w:noWrap/>
-            <w:vAlign w:val="center"/>
-          </w:tcPr>
-          <w:p>
-            <w:pPr>
-              <w:spacing w:before="0" w:after="0" w:line="240" w:lineRule="auto"/>
-              <w:jc w:val="center"/>
-              <w:rPr>
-                <w:sz w:val="14"/>
-                <w:szCs w:val="14"/>
-              </w:rPr>
-            </w:pPr>
-            <w:r>
-              <w:rPr>
-                <w:b w:val="0"/>
-                <w:sz w:val="14"/>
-              </w:rPr>
-              <w:t>177681.5</w:t>
+            <w:tcW w:type="dxa" w:w="758"/>
+            <w:noWrap/>
+            <w:vAlign w:val="center"/>
+          </w:tcPr>
+          <w:p>
+            <w:pPr>
+              <w:spacing w:before="0" w:after="0" w:line="240" w:lineRule="auto"/>
+              <w:jc w:val="center"/>
+              <w:rPr>
+                <w:sz w:val="14"/>
+                <w:szCs w:val="14"/>
+              </w:rPr>
+            </w:pPr>
+            <w:r>
+              <w:rPr>
+                <w:b w:val="0"/>
+                <w:sz w:val="14"/>
+              </w:rPr>
+              <w:t>36684.3</w:t>
+            </w:r>
+          </w:p>
+        </w:tc>
+        <w:tc>
+          <w:tcPr>
+            <w:tcW w:type="dxa" w:w="758"/>
+            <w:noWrap/>
+            <w:vAlign w:val="center"/>
+          </w:tcPr>
+          <w:p>
+            <w:pPr>
+              <w:spacing w:before="0" w:after="0" w:line="240" w:lineRule="auto"/>
+              <w:jc w:val="center"/>
+              <w:rPr>
+                <w:sz w:val="14"/>
+                <w:szCs w:val="14"/>
+              </w:rPr>
+            </w:pPr>
+            <w:r>
+              <w:rPr>
+                <w:b w:val="0"/>
+                <w:sz w:val="14"/>
+              </w:rPr>
+              <w:t>177677.5</w:t>
             </w:r>
           </w:p>
         </w:tc>
@@ -11719,7 +11815,7 @@
                 <w:b w:val="0"/>
                 <w:sz w:val="14"/>
               </w:rPr>
-              <w:t>-4154.6</w:t>
+              <w:t>-4154.8</w:t>
             </w:r>
           </w:p>
         </w:tc>
@@ -11991,7 +12087,7 @@
         </w:tc>
         <w:tc>
           <w:tcPr>
-            <w:tcW w:type="dxa" w:w="528"/>
+            <w:tcW w:type="dxa" w:w="529"/>
             <w:noWrap/>
             <w:vAlign w:val="center"/>
           </w:tcPr>
@@ -12039,7 +12135,7 @@
         </w:tc>
         <w:tc>
           <w:tcPr>
-            <w:tcW w:type="dxa" w:w="753"/>
+            <w:tcW w:type="dxa" w:w="758"/>
             <w:noWrap/>
             <w:vAlign w:val="center"/>
           </w:tcPr>
@@ -12063,25 +12159,25 @@
         </w:tc>
         <w:tc>
           <w:tcPr>
-            <w:tcW w:type="dxa" w:w="761"/>
-            <w:noWrap/>
-            <w:vAlign w:val="center"/>
-          </w:tcPr>
-          <w:p>
-            <w:pPr>
-              <w:spacing w:before="0" w:after="0" w:line="240" w:lineRule="auto"/>
-              <w:jc w:val="center"/>
-              <w:rPr>
-                <w:sz w:val="14"/>
-                <w:szCs w:val="14"/>
-              </w:rPr>
-            </w:pPr>
-            <w:r>
-              <w:rPr>
-                <w:b w:val="0"/>
-                <w:sz w:val="14"/>
-              </w:rPr>
-              <w:t>181836.1</w:t>
+            <w:tcW w:type="dxa" w:w="758"/>
+            <w:noWrap/>
+            <w:vAlign w:val="center"/>
+          </w:tcPr>
+          <w:p>
+            <w:pPr>
+              <w:spacing w:before="0" w:after="0" w:line="240" w:lineRule="auto"/>
+              <w:jc w:val="center"/>
+              <w:rPr>
+                <w:sz w:val="14"/>
+                <w:szCs w:val="14"/>
+              </w:rPr>
+            </w:pPr>
+            <w:r>
+              <w:rPr>
+                <w:b w:val="0"/>
+                <w:sz w:val="14"/>
+              </w:rPr>
+              <w:t>181832.3</w:t>
             </w:r>
           </w:p>
         </w:tc>
@@ -12153,7 +12249,7 @@
                 <w:b w:val="0"/>
                 <w:sz w:val="14"/>
               </w:rPr>
-              <w:t>-2685.7</w:t>
+              <w:t>-2685.9</w:t>
             </w:r>
           </w:p>
         </w:tc>
@@ -12425,7 +12521,7 @@
         </w:tc>
         <w:tc>
           <w:tcPr>
-            <w:tcW w:type="dxa" w:w="528"/>
+            <w:tcW w:type="dxa" w:w="529"/>
             <w:noWrap/>
             <w:vAlign w:val="center"/>
           </w:tcPr>
@@ -12473,7 +12569,7 @@
         </w:tc>
         <w:tc>
           <w:tcPr>
-            <w:tcW w:type="dxa" w:w="753"/>
+            <w:tcW w:type="dxa" w:w="758"/>
             <w:noWrap/>
             <w:vAlign w:val="center"/>
           </w:tcPr>
@@ -12497,25 +12593,25 @@
         </w:tc>
         <w:tc>
           <w:tcPr>
-            <w:tcW w:type="dxa" w:w="761"/>
-            <w:noWrap/>
-            <w:vAlign w:val="center"/>
-          </w:tcPr>
-          <w:p>
-            <w:pPr>
-              <w:spacing w:before="0" w:after="0" w:line="240" w:lineRule="auto"/>
-              <w:jc w:val="center"/>
-              <w:rPr>
-                <w:sz w:val="14"/>
-                <w:szCs w:val="14"/>
-              </w:rPr>
-            </w:pPr>
-            <w:r>
-              <w:rPr>
-                <w:b w:val="0"/>
-                <w:sz w:val="14"/>
-              </w:rPr>
-              <w:t>184521.9</w:t>
+            <w:tcW w:type="dxa" w:w="758"/>
+            <w:noWrap/>
+            <w:vAlign w:val="center"/>
+          </w:tcPr>
+          <w:p>
+            <w:pPr>
+              <w:spacing w:before="0" w:after="0" w:line="240" w:lineRule="auto"/>
+              <w:jc w:val="center"/>
+              <w:rPr>
+                <w:sz w:val="14"/>
+                <w:szCs w:val="14"/>
+              </w:rPr>
+            </w:pPr>
+            <w:r>
+              <w:rPr>
+                <w:b w:val="0"/>
+                <w:sz w:val="14"/>
+              </w:rPr>
+              <w:t>184518.2</w:t>
             </w:r>
           </w:p>
         </w:tc>
@@ -12587,7 +12683,7 @@
                 <w:b w:val="0"/>
                 <w:sz w:val="14"/>
               </w:rPr>
-              <w:t>-1187.1</w:t>
+              <w:t>-1187.3</w:t>
             </w:r>
           </w:p>
         </w:tc>
@@ -12859,7 +12955,7 @@
         </w:tc>
         <w:tc>
           <w:tcPr>
-            <w:tcW w:type="dxa" w:w="528"/>
+            <w:tcW w:type="dxa" w:w="529"/>
             <w:noWrap/>
             <w:vAlign w:val="center"/>
           </w:tcPr>
@@ -12907,7 +13003,7 @@
         </w:tc>
         <w:tc>
           <w:tcPr>
-            <w:tcW w:type="dxa" w:w="753"/>
+            <w:tcW w:type="dxa" w:w="758"/>
             <w:noWrap/>
             <w:vAlign w:val="center"/>
           </w:tcPr>
@@ -12931,25 +13027,25 @@
         </w:tc>
         <w:tc>
           <w:tcPr>
-            <w:tcW w:type="dxa" w:w="761"/>
-            <w:noWrap/>
-            <w:vAlign w:val="center"/>
-          </w:tcPr>
-          <w:p>
-            <w:pPr>
-              <w:spacing w:before="0" w:after="0" w:line="240" w:lineRule="auto"/>
-              <w:jc w:val="center"/>
-              <w:rPr>
-                <w:sz w:val="14"/>
-                <w:szCs w:val="14"/>
-              </w:rPr>
-            </w:pPr>
-            <w:r>
-              <w:rPr>
-                <w:b w:val="0"/>
-                <w:sz w:val="14"/>
-              </w:rPr>
-              <w:t>185709.0</w:t>
+            <w:tcW w:type="dxa" w:w="758"/>
+            <w:noWrap/>
+            <w:vAlign w:val="center"/>
+          </w:tcPr>
+          <w:p>
+            <w:pPr>
+              <w:spacing w:before="0" w:after="0" w:line="240" w:lineRule="auto"/>
+              <w:jc w:val="center"/>
+              <w:rPr>
+                <w:sz w:val="14"/>
+                <w:szCs w:val="14"/>
+              </w:rPr>
+            </w:pPr>
+            <w:r>
+              <w:rPr>
+                <w:b w:val="0"/>
+                <w:sz w:val="14"/>
+              </w:rPr>
+              <w:t>185705.5</w:t>
             </w:r>
           </w:p>
         </w:tc>
@@ -13021,7 +13117,7 @@
                 <w:b w:val="0"/>
                 <w:sz w:val="14"/>
               </w:rPr>
-              <w:t>317.2</w:t>
+              <w:t>317.1</w:t>
             </w:r>
           </w:p>
         </w:tc>
@@ -13293,7 +13389,7 @@
         </w:tc>
         <w:tc>
           <w:tcPr>
-            <w:tcW w:type="dxa" w:w="528"/>
+            <w:tcW w:type="dxa" w:w="529"/>
             <w:noWrap/>
             <w:vAlign w:val="center"/>
           </w:tcPr>
@@ -13341,7 +13437,7 @@
         </w:tc>
         <w:tc>
           <w:tcPr>
-            <w:tcW w:type="dxa" w:w="753"/>
+            <w:tcW w:type="dxa" w:w="758"/>
             <w:noWrap/>
             <w:vAlign w:val="center"/>
           </w:tcPr>
@@ -13365,25 +13461,25 @@
         </w:tc>
         <w:tc>
           <w:tcPr>
-            <w:tcW w:type="dxa" w:w="761"/>
-            <w:noWrap/>
-            <w:vAlign w:val="center"/>
-          </w:tcPr>
-          <w:p>
-            <w:pPr>
-              <w:spacing w:before="0" w:after="0" w:line="240" w:lineRule="auto"/>
-              <w:jc w:val="center"/>
-              <w:rPr>
-                <w:sz w:val="14"/>
-                <w:szCs w:val="14"/>
-              </w:rPr>
-            </w:pPr>
-            <w:r>
-              <w:rPr>
-                <w:b w:val="0"/>
-                <w:sz w:val="14"/>
-              </w:rPr>
-              <w:t>185391.8</w:t>
+            <w:tcW w:type="dxa" w:w="758"/>
+            <w:noWrap/>
+            <w:vAlign w:val="center"/>
+          </w:tcPr>
+          <w:p>
+            <w:pPr>
+              <w:spacing w:before="0" w:after="0" w:line="240" w:lineRule="auto"/>
+              <w:jc w:val="center"/>
+              <w:rPr>
+                <w:sz w:val="14"/>
+                <w:szCs w:val="14"/>
+              </w:rPr>
+            </w:pPr>
+            <w:r>
+              <w:rPr>
+                <w:b w:val="0"/>
+                <w:sz w:val="14"/>
+              </w:rPr>
+              <w:t>185388.5</w:t>
             </w:r>
           </w:p>
         </w:tc>
@@ -13455,7 +13551,7 @@
                 <w:b w:val="0"/>
                 <w:sz w:val="14"/>
               </w:rPr>
-              <w:t>1806.9</w:t>
+              <w:t>1806.7</w:t>
             </w:r>
           </w:p>
         </w:tc>
@@ -13727,7 +13823,7 @@
         </w:tc>
         <w:tc>
           <w:tcPr>
-            <w:tcW w:type="dxa" w:w="528"/>
+            <w:tcW w:type="dxa" w:w="529"/>
             <w:noWrap/>
             <w:vAlign w:val="center"/>
           </w:tcPr>
@@ -13775,7 +13871,7 @@
         </w:tc>
         <w:tc>
           <w:tcPr>
-            <w:tcW w:type="dxa" w:w="753"/>
+            <w:tcW w:type="dxa" w:w="758"/>
             <w:noWrap/>
             <w:vAlign w:val="center"/>
           </w:tcPr>
@@ -13799,25 +13895,25 @@
         </w:tc>
         <w:tc>
           <w:tcPr>
-            <w:tcW w:type="dxa" w:w="761"/>
-            <w:noWrap/>
-            <w:vAlign w:val="center"/>
-          </w:tcPr>
-          <w:p>
-            <w:pPr>
-              <w:spacing w:before="0" w:after="0" w:line="240" w:lineRule="auto"/>
-              <w:jc w:val="center"/>
-              <w:rPr>
-                <w:sz w:val="14"/>
-                <w:szCs w:val="14"/>
-              </w:rPr>
-            </w:pPr>
-            <w:r>
-              <w:rPr>
-                <w:b w:val="0"/>
-                <w:sz w:val="14"/>
-              </w:rPr>
-              <w:t>183584.9</w:t>
+            <w:tcW w:type="dxa" w:w="758"/>
+            <w:noWrap/>
+            <w:vAlign w:val="center"/>
+          </w:tcPr>
+          <w:p>
+            <w:pPr>
+              <w:spacing w:before="0" w:after="0" w:line="240" w:lineRule="auto"/>
+              <w:jc w:val="center"/>
+              <w:rPr>
+                <w:sz w:val="14"/>
+                <w:szCs w:val="14"/>
+              </w:rPr>
+            </w:pPr>
+            <w:r>
+              <w:rPr>
+                <w:b w:val="0"/>
+                <w:sz w:val="14"/>
+              </w:rPr>
+              <w:t>183581.8</w:t>
             </w:r>
           </w:p>
         </w:tc>
@@ -13889,7 +13985,7 @@
                 <w:b w:val="0"/>
                 <w:sz w:val="14"/>
               </w:rPr>
-              <w:t>3262.4</w:t>
+              <w:t>3262.3</w:t>
             </w:r>
           </w:p>
         </w:tc>
@@ -14161,7 +14257,7 @@
         </w:tc>
         <w:tc>
           <w:tcPr>
-            <w:tcW w:type="dxa" w:w="528"/>
+            <w:tcW w:type="dxa" w:w="529"/>
             <w:noWrap/>
             <w:vAlign w:val="center"/>
           </w:tcPr>
@@ -14209,49 +14305,49 @@
         </w:tc>
         <w:tc>
           <w:tcPr>
-            <w:tcW w:type="dxa" w:w="753"/>
-            <w:noWrap/>
-            <w:vAlign w:val="center"/>
-          </w:tcPr>
-          <w:p>
-            <w:pPr>
-              <w:spacing w:before="0" w:after="0" w:line="240" w:lineRule="auto"/>
-              <w:jc w:val="center"/>
-              <w:rPr>
-                <w:sz w:val="14"/>
-                <w:szCs w:val="14"/>
-              </w:rPr>
-            </w:pPr>
-            <w:r>
-              <w:rPr>
-                <w:b w:val="0"/>
-                <w:sz w:val="14"/>
-              </w:rPr>
-              <w:t>31655.6</w:t>
-            </w:r>
-          </w:p>
-        </w:tc>
-        <w:tc>
-          <w:tcPr>
-            <w:tcW w:type="dxa" w:w="761"/>
-            <w:noWrap/>
-            <w:vAlign w:val="center"/>
-          </w:tcPr>
-          <w:p>
-            <w:pPr>
-              <w:spacing w:before="0" w:after="0" w:line="240" w:lineRule="auto"/>
-              <w:jc w:val="center"/>
-              <w:rPr>
-                <w:sz w:val="14"/>
-                <w:szCs w:val="14"/>
-              </w:rPr>
-            </w:pPr>
-            <w:r>
-              <w:rPr>
-                <w:b w:val="0"/>
-                <w:sz w:val="14"/>
-              </w:rPr>
-              <w:t>180322.4</w:t>
+            <w:tcW w:type="dxa" w:w="758"/>
+            <w:noWrap/>
+            <w:vAlign w:val="center"/>
+          </w:tcPr>
+          <w:p>
+            <w:pPr>
+              <w:spacing w:before="0" w:after="0" w:line="240" w:lineRule="auto"/>
+              <w:jc w:val="center"/>
+              <w:rPr>
+                <w:sz w:val="14"/>
+                <w:szCs w:val="14"/>
+              </w:rPr>
+            </w:pPr>
+            <w:r>
+              <w:rPr>
+                <w:b w:val="0"/>
+                <w:sz w:val="14"/>
+              </w:rPr>
+              <w:t>31655.5</w:t>
+            </w:r>
+          </w:p>
+        </w:tc>
+        <w:tc>
+          <w:tcPr>
+            <w:tcW w:type="dxa" w:w="758"/>
+            <w:noWrap/>
+            <w:vAlign w:val="center"/>
+          </w:tcPr>
+          <w:p>
+            <w:pPr>
+              <w:spacing w:before="0" w:after="0" w:line="240" w:lineRule="auto"/>
+              <w:jc w:val="center"/>
+              <w:rPr>
+                <w:sz w:val="14"/>
+                <w:szCs w:val="14"/>
+              </w:rPr>
+            </w:pPr>
+            <w:r>
+              <w:rPr>
+                <w:b w:val="0"/>
+                <w:sz w:val="14"/>
+              </w:rPr>
+              <w:t>180319.5</w:t>
             </w:r>
           </w:p>
         </w:tc>
@@ -14323,7 +14419,7 @@
                 <w:b w:val="0"/>
                 <w:sz w:val="14"/>
               </w:rPr>
-              <w:t>4665.3</w:t>
+              <w:t>4665.2</w:t>
             </w:r>
           </w:p>
         </w:tc>
@@ -14595,7 +14691,7 @@
         </w:tc>
         <w:tc>
           <w:tcPr>
-            <w:tcW w:type="dxa" w:w="528"/>
+            <w:tcW w:type="dxa" w:w="529"/>
             <w:noWrap/>
             <w:vAlign w:val="center"/>
           </w:tcPr>
@@ -14643,49 +14739,49 @@
         </w:tc>
         <w:tc>
           <w:tcPr>
-            <w:tcW w:type="dxa" w:w="753"/>
-            <w:noWrap/>
-            <w:vAlign w:val="center"/>
-          </w:tcPr>
-          <w:p>
-            <w:pPr>
-              <w:spacing w:before="0" w:after="0" w:line="240" w:lineRule="auto"/>
-              <w:jc w:val="center"/>
-              <w:rPr>
-                <w:sz w:val="14"/>
-                <w:szCs w:val="14"/>
-              </w:rPr>
-            </w:pPr>
-            <w:r>
-              <w:rPr>
-                <w:b w:val="0"/>
-                <w:sz w:val="14"/>
-              </w:rPr>
-              <w:t>30650.0</w:t>
-            </w:r>
-          </w:p>
-        </w:tc>
-        <w:tc>
-          <w:tcPr>
-            <w:tcW w:type="dxa" w:w="761"/>
-            <w:noWrap/>
-            <w:vAlign w:val="center"/>
-          </w:tcPr>
-          <w:p>
-            <w:pPr>
-              <w:spacing w:before="0" w:after="0" w:line="240" w:lineRule="auto"/>
-              <w:jc w:val="center"/>
-              <w:rPr>
-                <w:sz w:val="14"/>
-                <w:szCs w:val="14"/>
-              </w:rPr>
-            </w:pPr>
-            <w:r>
-              <w:rPr>
-                <w:b w:val="0"/>
-                <w:sz w:val="14"/>
-              </w:rPr>
-              <w:t>175657.1</w:t>
+            <w:tcW w:type="dxa" w:w="758"/>
+            <w:noWrap/>
+            <w:vAlign w:val="center"/>
+          </w:tcPr>
+          <w:p>
+            <w:pPr>
+              <w:spacing w:before="0" w:after="0" w:line="240" w:lineRule="auto"/>
+              <w:jc w:val="center"/>
+              <w:rPr>
+                <w:sz w:val="14"/>
+                <w:szCs w:val="14"/>
+              </w:rPr>
+            </w:pPr>
+            <w:r>
+              <w:rPr>
+                <w:b w:val="0"/>
+                <w:sz w:val="14"/>
+              </w:rPr>
+              <w:t>30649.9</w:t>
+            </w:r>
+          </w:p>
+        </w:tc>
+        <w:tc>
+          <w:tcPr>
+            <w:tcW w:type="dxa" w:w="758"/>
+            <w:noWrap/>
+            <w:vAlign w:val="center"/>
+          </w:tcPr>
+          <w:p>
+            <w:pPr>
+              <w:spacing w:before="0" w:after="0" w:line="240" w:lineRule="auto"/>
+              <w:jc w:val="center"/>
+              <w:rPr>
+                <w:sz w:val="14"/>
+                <w:szCs w:val="14"/>
+              </w:rPr>
+            </w:pPr>
+            <w:r>
+              <w:rPr>
+                <w:b w:val="0"/>
+                <w:sz w:val="14"/>
+              </w:rPr>
+              <w:t>175654.4</w:t>
             </w:r>
           </w:p>
         </w:tc>
@@ -14757,7 +14853,7 @@
                 <w:b w:val="0"/>
                 <w:sz w:val="14"/>
               </w:rPr>
-              <w:t>5997.3</w:t>
+              <w:t>5997.1</w:t>
             </w:r>
           </w:p>
         </w:tc>
@@ -15029,7 +15125,7 @@
         </w:tc>
         <w:tc>
           <w:tcPr>
-            <w:tcW w:type="dxa" w:w="528"/>
+            <w:tcW w:type="dxa" w:w="529"/>
             <w:noWrap/>
             <w:vAlign w:val="center"/>
           </w:tcPr>
@@ -15077,7 +15173,7 @@
         </w:tc>
         <w:tc>
           <w:tcPr>
-            <w:tcW w:type="dxa" w:w="753"/>
+            <w:tcW w:type="dxa" w:w="758"/>
             <w:noWrap/>
             <w:vAlign w:val="center"/>
           </w:tcPr>
@@ -15101,25 +15197,25 @@
         </w:tc>
         <w:tc>
           <w:tcPr>
-            <w:tcW w:type="dxa" w:w="761"/>
-            <w:noWrap/>
-            <w:vAlign w:val="center"/>
-          </w:tcPr>
-          <w:p>
-            <w:pPr>
-              <w:spacing w:before="0" w:after="0" w:line="240" w:lineRule="auto"/>
-              <w:jc w:val="center"/>
-              <w:rPr>
-                <w:sz w:val="14"/>
-                <w:szCs w:val="14"/>
-              </w:rPr>
-            </w:pPr>
-            <w:r>
-              <w:rPr>
-                <w:b w:val="0"/>
-                <w:sz w:val="14"/>
-              </w:rPr>
-              <w:t>169659.8</w:t>
+            <w:tcW w:type="dxa" w:w="758"/>
+            <w:noWrap/>
+            <w:vAlign w:val="center"/>
+          </w:tcPr>
+          <w:p>
+            <w:pPr>
+              <w:spacing w:before="0" w:after="0" w:line="240" w:lineRule="auto"/>
+              <w:jc w:val="center"/>
+              <w:rPr>
+                <w:sz w:val="14"/>
+                <w:szCs w:val="14"/>
+              </w:rPr>
+            </w:pPr>
+            <w:r>
+              <w:rPr>
+                <w:b w:val="0"/>
+                <w:sz w:val="14"/>
+              </w:rPr>
+              <w:t>169657.3</w:t>
             </w:r>
           </w:p>
         </w:tc>
@@ -15191,7 +15287,7 @@
                 <w:b w:val="0"/>
                 <w:sz w:val="14"/>
               </w:rPr>
-              <w:t>7239.7</w:t>
+              <w:t>7239.5</w:t>
             </w:r>
           </w:p>
         </w:tc>
@@ -15463,7 +15559,7 @@
         </w:tc>
         <w:tc>
           <w:tcPr>
-            <w:tcW w:type="dxa" w:w="528"/>
+            <w:tcW w:type="dxa" w:w="529"/>
             <w:noWrap/>
             <w:vAlign w:val="center"/>
           </w:tcPr>
@@ -15511,49 +15607,49 @@
         </w:tc>
         <w:tc>
           <w:tcPr>
-            <w:tcW w:type="dxa" w:w="753"/>
-            <w:noWrap/>
-            <w:vAlign w:val="center"/>
-          </w:tcPr>
-          <w:p>
-            <w:pPr>
-              <w:spacing w:before="0" w:after="0" w:line="240" w:lineRule="auto"/>
-              <w:jc w:val="center"/>
-              <w:rPr>
-                <w:sz w:val="14"/>
-                <w:szCs w:val="14"/>
-              </w:rPr>
-            </w:pPr>
-            <w:r>
-              <w:rPr>
-                <w:b w:val="0"/>
-                <w:sz w:val="14"/>
-              </w:rPr>
-              <w:t>28396.6</w:t>
-            </w:r>
-          </w:p>
-        </w:tc>
-        <w:tc>
-          <w:tcPr>
-            <w:tcW w:type="dxa" w:w="761"/>
-            <w:noWrap/>
-            <w:vAlign w:val="center"/>
-          </w:tcPr>
-          <w:p>
-            <w:pPr>
-              <w:spacing w:before="0" w:after="0" w:line="240" w:lineRule="auto"/>
-              <w:jc w:val="center"/>
-              <w:rPr>
-                <w:sz w:val="14"/>
-                <w:szCs w:val="14"/>
-              </w:rPr>
-            </w:pPr>
-            <w:r>
-              <w:rPr>
-                <w:b w:val="0"/>
-                <w:sz w:val="14"/>
-              </w:rPr>
-              <w:t>162420.1</w:t>
+            <w:tcW w:type="dxa" w:w="758"/>
+            <w:noWrap/>
+            <w:vAlign w:val="center"/>
+          </w:tcPr>
+          <w:p>
+            <w:pPr>
+              <w:spacing w:before="0" w:after="0" w:line="240" w:lineRule="auto"/>
+              <w:jc w:val="center"/>
+              <w:rPr>
+                <w:sz w:val="14"/>
+                <w:szCs w:val="14"/>
+              </w:rPr>
+            </w:pPr>
+            <w:r>
+              <w:rPr>
+                <w:b w:val="0"/>
+                <w:sz w:val="14"/>
+              </w:rPr>
+              <w:t>28396.5</w:t>
+            </w:r>
+          </w:p>
+        </w:tc>
+        <w:tc>
+          <w:tcPr>
+            <w:tcW w:type="dxa" w:w="758"/>
+            <w:noWrap/>
+            <w:vAlign w:val="center"/>
+          </w:tcPr>
+          <w:p>
+            <w:pPr>
+              <w:spacing w:before="0" w:after="0" w:line="240" w:lineRule="auto"/>
+              <w:jc w:val="center"/>
+              <w:rPr>
+                <w:sz w:val="14"/>
+                <w:szCs w:val="14"/>
+              </w:rPr>
+            </w:pPr>
+            <w:r>
+              <w:rPr>
+                <w:b w:val="0"/>
+                <w:sz w:val="14"/>
+              </w:rPr>
+              <w:t>162417.8</w:t>
             </w:r>
           </w:p>
         </w:tc>
@@ -15625,7 +15721,7 @@
                 <w:b w:val="0"/>
                 <w:sz w:val="14"/>
               </w:rPr>
-              <w:t>8373.1</w:t>
+              <w:t>8372.9</w:t>
             </w:r>
           </w:p>
         </w:tc>
@@ -15897,7 +15993,7 @@
         </w:tc>
         <w:tc>
           <w:tcPr>
-            <w:tcW w:type="dxa" w:w="528"/>
+            <w:tcW w:type="dxa" w:w="529"/>
             <w:noWrap/>
             <w:vAlign w:val="center"/>
           </w:tcPr>
@@ -15945,49 +16041,49 @@
         </w:tc>
         <w:tc>
           <w:tcPr>
-            <w:tcW w:type="dxa" w:w="753"/>
-            <w:noWrap/>
-            <w:vAlign w:val="center"/>
-          </w:tcPr>
-          <w:p>
-            <w:pPr>
-              <w:spacing w:before="0" w:after="0" w:line="240" w:lineRule="auto"/>
-              <w:jc w:val="center"/>
-              <w:rPr>
-                <w:sz w:val="14"/>
-                <w:szCs w:val="14"/>
-              </w:rPr>
-            </w:pPr>
-            <w:r>
-              <w:rPr>
-                <w:b w:val="0"/>
-                <w:sz w:val="14"/>
-              </w:rPr>
-              <w:t>27124.8</w:t>
-            </w:r>
-          </w:p>
-        </w:tc>
-        <w:tc>
-          <w:tcPr>
-            <w:tcW w:type="dxa" w:w="761"/>
-            <w:noWrap/>
-            <w:vAlign w:val="center"/>
-          </w:tcPr>
-          <w:p>
-            <w:pPr>
-              <w:spacing w:before="0" w:after="0" w:line="240" w:lineRule="auto"/>
-              <w:jc w:val="center"/>
-              <w:rPr>
-                <w:sz w:val="14"/>
-                <w:szCs w:val="14"/>
-              </w:rPr>
-            </w:pPr>
-            <w:r>
-              <w:rPr>
-                <w:b w:val="0"/>
-                <w:sz w:val="14"/>
-              </w:rPr>
-              <w:t>154047.1</w:t>
+            <w:tcW w:type="dxa" w:w="758"/>
+            <w:noWrap/>
+            <w:vAlign w:val="center"/>
+          </w:tcPr>
+          <w:p>
+            <w:pPr>
+              <w:spacing w:before="0" w:after="0" w:line="240" w:lineRule="auto"/>
+              <w:jc w:val="center"/>
+              <w:rPr>
+                <w:sz w:val="14"/>
+                <w:szCs w:val="14"/>
+              </w:rPr>
+            </w:pPr>
+            <w:r>
+              <w:rPr>
+                <w:b w:val="0"/>
+                <w:sz w:val="14"/>
+              </w:rPr>
+              <w:t>27124.7</w:t>
+            </w:r>
+          </w:p>
+        </w:tc>
+        <w:tc>
+          <w:tcPr>
+            <w:tcW w:type="dxa" w:w="758"/>
+            <w:noWrap/>
+            <w:vAlign w:val="center"/>
+          </w:tcPr>
+          <w:p>
+            <w:pPr>
+              <w:spacing w:before="0" w:after="0" w:line="240" w:lineRule="auto"/>
+              <w:jc w:val="center"/>
+              <w:rPr>
+                <w:sz w:val="14"/>
+                <w:szCs w:val="14"/>
+              </w:rPr>
+            </w:pPr>
+            <w:r>
+              <w:rPr>
+                <w:b w:val="0"/>
+                <w:sz w:val="14"/>
+              </w:rPr>
+              <w:t>154044.9</w:t>
             </w:r>
           </w:p>
         </w:tc>
@@ -16059,7 +16155,7 @@
                 <w:b w:val="0"/>
                 <w:sz w:val="14"/>
               </w:rPr>
-              <w:t>9376.9</w:t>
+              <w:t>9376.7</w:t>
             </w:r>
           </w:p>
         </w:tc>
@@ -16331,7 +16427,7 @@
         </w:tc>
         <w:tc>
           <w:tcPr>
-            <w:tcW w:type="dxa" w:w="528"/>
+            <w:tcW w:type="dxa" w:w="529"/>
             <w:noWrap/>
             <w:vAlign w:val="center"/>
           </w:tcPr>
@@ -16379,49 +16475,49 @@
         </w:tc>
         <w:tc>
           <w:tcPr>
-            <w:tcW w:type="dxa" w:w="753"/>
-            <w:noWrap/>
-            <w:vAlign w:val="center"/>
-          </w:tcPr>
-          <w:p>
-            <w:pPr>
-              <w:spacing w:before="0" w:after="0" w:line="240" w:lineRule="auto"/>
-              <w:jc w:val="center"/>
-              <w:rPr>
-                <w:sz w:val="14"/>
-                <w:szCs w:val="14"/>
-              </w:rPr>
-            </w:pPr>
-            <w:r>
-              <w:rPr>
-                <w:b w:val="0"/>
-                <w:sz w:val="14"/>
-              </w:rPr>
-              <w:t>25738.6</w:t>
-            </w:r>
-          </w:p>
-        </w:tc>
-        <w:tc>
-          <w:tcPr>
-            <w:tcW w:type="dxa" w:w="761"/>
-            <w:noWrap/>
-            <w:vAlign w:val="center"/>
-          </w:tcPr>
-          <w:p>
-            <w:pPr>
-              <w:spacing w:before="0" w:after="0" w:line="240" w:lineRule="auto"/>
-              <w:jc w:val="center"/>
-              <w:rPr>
-                <w:sz w:val="14"/>
-                <w:szCs w:val="14"/>
-              </w:rPr>
-            </w:pPr>
-            <w:r>
-              <w:rPr>
-                <w:b w:val="0"/>
-                <w:sz w:val="14"/>
-              </w:rPr>
-              <w:t>144670.2</w:t>
+            <w:tcW w:type="dxa" w:w="758"/>
+            <w:noWrap/>
+            <w:vAlign w:val="center"/>
+          </w:tcPr>
+          <w:p>
+            <w:pPr>
+              <w:spacing w:before="0" w:after="0" w:line="240" w:lineRule="auto"/>
+              <w:jc w:val="center"/>
+              <w:rPr>
+                <w:sz w:val="14"/>
+                <w:szCs w:val="14"/>
+              </w:rPr>
+            </w:pPr>
+            <w:r>
+              <w:rPr>
+                <w:b w:val="0"/>
+                <w:sz w:val="14"/>
+              </w:rPr>
+              <w:t>25738.5</w:t>
+            </w:r>
+          </w:p>
+        </w:tc>
+        <w:tc>
+          <w:tcPr>
+            <w:tcW w:type="dxa" w:w="758"/>
+            <w:noWrap/>
+            <w:vAlign w:val="center"/>
+          </w:tcPr>
+          <w:p>
+            <w:pPr>
+              <w:spacing w:before="0" w:after="0" w:line="240" w:lineRule="auto"/>
+              <w:jc w:val="center"/>
+              <w:rPr>
+                <w:sz w:val="14"/>
+                <w:szCs w:val="14"/>
+              </w:rPr>
+            </w:pPr>
+            <w:r>
+              <w:rPr>
+                <w:b w:val="0"/>
+                <w:sz w:val="14"/>
+              </w:rPr>
+              <w:t>144668.2</w:t>
             </w:r>
           </w:p>
         </w:tc>
@@ -16493,7 +16589,7 @@
                 <w:b w:val="0"/>
                 <w:sz w:val="14"/>
               </w:rPr>
-              <w:t>10228.8</w:t>
+              <w:t>10228.6</w:t>
             </w:r>
           </w:p>
         </w:tc>
@@ -16765,7 +16861,7 @@
         </w:tc>
         <w:tc>
           <w:tcPr>
-            <w:tcW w:type="dxa" w:w="528"/>
+            <w:tcW w:type="dxa" w:w="529"/>
             <w:noWrap/>
             <w:vAlign w:val="center"/>
           </w:tcPr>
@@ -16813,49 +16909,49 @@
         </w:tc>
         <w:tc>
           <w:tcPr>
-            <w:tcW w:type="dxa" w:w="753"/>
-            <w:noWrap/>
-            <w:vAlign w:val="center"/>
-          </w:tcPr>
-          <w:p>
-            <w:pPr>
-              <w:spacing w:before="0" w:after="0" w:line="240" w:lineRule="auto"/>
-              <w:jc w:val="center"/>
-              <w:rPr>
-                <w:sz w:val="14"/>
-                <w:szCs w:val="14"/>
-              </w:rPr>
-            </w:pPr>
-            <w:r>
-              <w:rPr>
-                <w:b w:val="0"/>
-                <w:sz w:val="14"/>
-              </w:rPr>
-              <w:t>24222.9</w:t>
-            </w:r>
-          </w:p>
-        </w:tc>
-        <w:tc>
-          <w:tcPr>
-            <w:tcW w:type="dxa" w:w="761"/>
-            <w:noWrap/>
-            <w:vAlign w:val="center"/>
-          </w:tcPr>
-          <w:p>
-            <w:pPr>
-              <w:spacing w:before="0" w:after="0" w:line="240" w:lineRule="auto"/>
-              <w:jc w:val="center"/>
-              <w:rPr>
-                <w:sz w:val="14"/>
-                <w:szCs w:val="14"/>
-              </w:rPr>
-            </w:pPr>
-            <w:r>
-              <w:rPr>
-                <w:b w:val="0"/>
-                <w:sz w:val="14"/>
-              </w:rPr>
-              <w:t>134441.4</w:t>
+            <w:tcW w:type="dxa" w:w="758"/>
+            <w:noWrap/>
+            <w:vAlign w:val="center"/>
+          </w:tcPr>
+          <w:p>
+            <w:pPr>
+              <w:spacing w:before="0" w:after="0" w:line="240" w:lineRule="auto"/>
+              <w:jc w:val="center"/>
+              <w:rPr>
+                <w:sz w:val="14"/>
+                <w:szCs w:val="14"/>
+              </w:rPr>
+            </w:pPr>
+            <w:r>
+              <w:rPr>
+                <w:b w:val="0"/>
+                <w:sz w:val="14"/>
+              </w:rPr>
+              <w:t>24222.8</w:t>
+            </w:r>
+          </w:p>
+        </w:tc>
+        <w:tc>
+          <w:tcPr>
+            <w:tcW w:type="dxa" w:w="758"/>
+            <w:noWrap/>
+            <w:vAlign w:val="center"/>
+          </w:tcPr>
+          <w:p>
+            <w:pPr>
+              <w:spacing w:before="0" w:after="0" w:line="240" w:lineRule="auto"/>
+              <w:jc w:val="center"/>
+              <w:rPr>
+                <w:sz w:val="14"/>
+                <w:szCs w:val="14"/>
+              </w:rPr>
+            </w:pPr>
+            <w:r>
+              <w:rPr>
+                <w:b w:val="0"/>
+                <w:sz w:val="14"/>
+              </w:rPr>
+              <w:t>134439.5</w:t>
             </w:r>
           </w:p>
         </w:tc>
@@ -16927,7 +17023,7 @@
                 <w:b w:val="0"/>
                 <w:sz w:val="14"/>
               </w:rPr>
-              <w:t>10904.6</w:t>
+              <w:t>10904.4</w:t>
             </w:r>
           </w:p>
         </w:tc>
@@ -17199,7 +17295,7 @@
         </w:tc>
         <w:tc>
           <w:tcPr>
-            <w:tcW w:type="dxa" w:w="528"/>
+            <w:tcW w:type="dxa" w:w="529"/>
             <w:noWrap/>
             <w:vAlign w:val="center"/>
           </w:tcPr>
@@ -17247,49 +17343,49 @@
         </w:tc>
         <w:tc>
           <w:tcPr>
-            <w:tcW w:type="dxa" w:w="753"/>
-            <w:noWrap/>
-            <w:vAlign w:val="center"/>
-          </w:tcPr>
-          <w:p>
-            <w:pPr>
-              <w:spacing w:before="0" w:after="0" w:line="240" w:lineRule="auto"/>
-              <w:jc w:val="center"/>
-              <w:rPr>
-                <w:sz w:val="14"/>
-                <w:szCs w:val="14"/>
-              </w:rPr>
-            </w:pPr>
-            <w:r>
-              <w:rPr>
-                <w:b w:val="0"/>
-                <w:sz w:val="14"/>
-              </w:rPr>
-              <w:t>22560.6</w:t>
-            </w:r>
-          </w:p>
-        </w:tc>
-        <w:tc>
-          <w:tcPr>
-            <w:tcW w:type="dxa" w:w="761"/>
-            <w:noWrap/>
-            <w:vAlign w:val="center"/>
-          </w:tcPr>
-          <w:p>
-            <w:pPr>
-              <w:spacing w:before="0" w:after="0" w:line="240" w:lineRule="auto"/>
-              <w:jc w:val="center"/>
-              <w:rPr>
-                <w:sz w:val="14"/>
-                <w:szCs w:val="14"/>
-              </w:rPr>
-            </w:pPr>
-            <w:r>
-              <w:rPr>
-                <w:b w:val="0"/>
-                <w:sz w:val="14"/>
-              </w:rPr>
-              <w:t>123536.8</w:t>
+            <w:tcW w:type="dxa" w:w="758"/>
+            <w:noWrap/>
+            <w:vAlign w:val="center"/>
+          </w:tcPr>
+          <w:p>
+            <w:pPr>
+              <w:spacing w:before="0" w:after="0" w:line="240" w:lineRule="auto"/>
+              <w:jc w:val="center"/>
+              <w:rPr>
+                <w:sz w:val="14"/>
+                <w:szCs w:val="14"/>
+              </w:rPr>
+            </w:pPr>
+            <w:r>
+              <w:rPr>
+                <w:b w:val="0"/>
+                <w:sz w:val="14"/>
+              </w:rPr>
+              <w:t>22560.5</w:t>
+            </w:r>
+          </w:p>
+        </w:tc>
+        <w:tc>
+          <w:tcPr>
+            <w:tcW w:type="dxa" w:w="758"/>
+            <w:noWrap/>
+            <w:vAlign w:val="center"/>
+          </w:tcPr>
+          <w:p>
+            <w:pPr>
+              <w:spacing w:before="0" w:after="0" w:line="240" w:lineRule="auto"/>
+              <w:jc w:val="center"/>
+              <w:rPr>
+                <w:sz w:val="14"/>
+                <w:szCs w:val="14"/>
+              </w:rPr>
+            </w:pPr>
+            <w:r>
+              <w:rPr>
+                <w:b w:val="0"/>
+                <w:sz w:val="14"/>
+              </w:rPr>
+              <w:t>123535.1</w:t>
             </w:r>
           </w:p>
         </w:tc>
@@ -17361,7 +17457,7 @@
                 <w:b w:val="0"/>
                 <w:sz w:val="14"/>
               </w:rPr>
-              <w:t>11376.9</w:t>
+              <w:t>11376.8</w:t>
             </w:r>
           </w:p>
         </w:tc>
@@ -17633,7 +17729,7 @@
         </w:tc>
         <w:tc>
           <w:tcPr>
-            <w:tcW w:type="dxa" w:w="528"/>
+            <w:tcW w:type="dxa" w:w="529"/>
             <w:noWrap/>
             <w:vAlign w:val="center"/>
           </w:tcPr>
@@ -17681,49 +17777,49 @@
         </w:tc>
         <w:tc>
           <w:tcPr>
-            <w:tcW w:type="dxa" w:w="753"/>
-            <w:noWrap/>
-            <w:vAlign w:val="center"/>
-          </w:tcPr>
-          <w:p>
-            <w:pPr>
-              <w:spacing w:before="0" w:after="0" w:line="240" w:lineRule="auto"/>
-              <w:jc w:val="center"/>
-              <w:rPr>
-                <w:sz w:val="14"/>
-                <w:szCs w:val="14"/>
-              </w:rPr>
-            </w:pPr>
-            <w:r>
-              <w:rPr>
-                <w:b w:val="0"/>
-                <w:sz w:val="14"/>
-              </w:rPr>
-              <w:t>20731.7</w:t>
-            </w:r>
-          </w:p>
-        </w:tc>
-        <w:tc>
-          <w:tcPr>
-            <w:tcW w:type="dxa" w:w="761"/>
-            <w:noWrap/>
-            <w:vAlign w:val="center"/>
-          </w:tcPr>
-          <w:p>
-            <w:pPr>
-              <w:spacing w:before="0" w:after="0" w:line="240" w:lineRule="auto"/>
-              <w:jc w:val="center"/>
-              <w:rPr>
-                <w:sz w:val="14"/>
-                <w:szCs w:val="14"/>
-              </w:rPr>
-            </w:pPr>
-            <w:r>
-              <w:rPr>
-                <w:b w:val="0"/>
-                <w:sz w:val="14"/>
-              </w:rPr>
-              <w:t>112159.8</w:t>
+            <w:tcW w:type="dxa" w:w="758"/>
+            <w:noWrap/>
+            <w:vAlign w:val="center"/>
+          </w:tcPr>
+          <w:p>
+            <w:pPr>
+              <w:spacing w:before="0" w:after="0" w:line="240" w:lineRule="auto"/>
+              <w:jc w:val="center"/>
+              <w:rPr>
+                <w:sz w:val="14"/>
+                <w:szCs w:val="14"/>
+              </w:rPr>
+            </w:pPr>
+            <w:r>
+              <w:rPr>
+                <w:b w:val="0"/>
+                <w:sz w:val="14"/>
+              </w:rPr>
+              <w:t>20731.6</w:t>
+            </w:r>
+          </w:p>
+        </w:tc>
+        <w:tc>
+          <w:tcPr>
+            <w:tcW w:type="dxa" w:w="758"/>
+            <w:noWrap/>
+            <w:vAlign w:val="center"/>
+          </w:tcPr>
+          <w:p>
+            <w:pPr>
+              <w:spacing w:before="0" w:after="0" w:line="240" w:lineRule="auto"/>
+              <w:jc w:val="center"/>
+              <w:rPr>
+                <w:sz w:val="14"/>
+                <w:szCs w:val="14"/>
+              </w:rPr>
+            </w:pPr>
+            <w:r>
+              <w:rPr>
+                <w:b w:val="0"/>
+                <w:sz w:val="14"/>
+              </w:rPr>
+              <w:t>112158.4</w:t>
             </w:r>
           </w:p>
         </w:tc>
@@ -17795,7 +17891,7 @@
                 <w:b w:val="0"/>
                 <w:sz w:val="14"/>
               </w:rPr>
-              <w:t>11615.0</w:t>
+              <w:t>11614.9</w:t>
             </w:r>
           </w:p>
         </w:tc>
@@ -18067,7 +18163,7 @@
         </w:tc>
         <w:tc>
           <w:tcPr>
-            <w:tcW w:type="dxa" w:w="528"/>
+            <w:tcW w:type="dxa" w:w="529"/>
             <w:noWrap/>
             <w:vAlign w:val="center"/>
           </w:tcPr>
@@ -18115,49 +18211,49 @@
         </w:tc>
         <w:tc>
           <w:tcPr>
-            <w:tcW w:type="dxa" w:w="753"/>
-            <w:noWrap/>
-            <w:vAlign w:val="center"/>
-          </w:tcPr>
-          <w:p>
-            <w:pPr>
-              <w:spacing w:before="0" w:after="0" w:line="240" w:lineRule="auto"/>
-              <w:jc w:val="center"/>
-              <w:rPr>
-                <w:sz w:val="14"/>
-                <w:szCs w:val="14"/>
-              </w:rPr>
-            </w:pPr>
-            <w:r>
-              <w:rPr>
-                <w:b w:val="0"/>
-                <w:sz w:val="14"/>
-              </w:rPr>
-              <w:t>18712.0</w:t>
-            </w:r>
-          </w:p>
-        </w:tc>
-        <w:tc>
-          <w:tcPr>
-            <w:tcW w:type="dxa" w:w="761"/>
-            <w:noWrap/>
-            <w:vAlign w:val="center"/>
-          </w:tcPr>
-          <w:p>
-            <w:pPr>
-              <w:spacing w:before="0" w:after="0" w:line="240" w:lineRule="auto"/>
-              <w:jc w:val="center"/>
-              <w:rPr>
-                <w:sz w:val="14"/>
-                <w:szCs w:val="14"/>
-              </w:rPr>
-            </w:pPr>
-            <w:r>
-              <w:rPr>
-                <w:b w:val="0"/>
-                <w:sz w:val="14"/>
-              </w:rPr>
-              <w:t>100544.8</w:t>
+            <w:tcW w:type="dxa" w:w="758"/>
+            <w:noWrap/>
+            <w:vAlign w:val="center"/>
+          </w:tcPr>
+          <w:p>
+            <w:pPr>
+              <w:spacing w:before="0" w:after="0" w:line="240" w:lineRule="auto"/>
+              <w:jc w:val="center"/>
+              <w:rPr>
+                <w:sz w:val="14"/>
+                <w:szCs w:val="14"/>
+              </w:rPr>
+            </w:pPr>
+            <w:r>
+              <w:rPr>
+                <w:b w:val="0"/>
+                <w:sz w:val="14"/>
+              </w:rPr>
+              <w:t>18711.9</w:t>
+            </w:r>
+          </w:p>
+        </w:tc>
+        <w:tc>
+          <w:tcPr>
+            <w:tcW w:type="dxa" w:w="758"/>
+            <w:noWrap/>
+            <w:vAlign w:val="center"/>
+          </w:tcPr>
+          <w:p>
+            <w:pPr>
+              <w:spacing w:before="0" w:after="0" w:line="240" w:lineRule="auto"/>
+              <w:jc w:val="center"/>
+              <w:rPr>
+                <w:sz w:val="14"/>
+                <w:szCs w:val="14"/>
+              </w:rPr>
+            </w:pPr>
+            <w:r>
+              <w:rPr>
+                <w:b w:val="0"/>
+                <w:sz w:val="14"/>
+              </w:rPr>
+              <w:t>100543.5</w:t>
             </w:r>
           </w:p>
         </w:tc>
@@ -18229,7 +18325,7 @@
                 <w:b w:val="0"/>
                 <w:sz w:val="14"/>
               </w:rPr>
-              <w:t>11583.0</w:t>
+              <w:t>11582.8</w:t>
             </w:r>
           </w:p>
         </w:tc>
@@ -18501,7 +18597,7 @@
         </w:tc>
         <w:tc>
           <w:tcPr>
-            <w:tcW w:type="dxa" w:w="528"/>
+            <w:tcW w:type="dxa" w:w="529"/>
             <w:noWrap/>
             <w:vAlign w:val="center"/>
           </w:tcPr>
@@ -18549,49 +18645,49 @@
         </w:tc>
         <w:tc>
           <w:tcPr>
-            <w:tcW w:type="dxa" w:w="753"/>
-            <w:noWrap/>
-            <w:vAlign w:val="center"/>
-          </w:tcPr>
-          <w:p>
-            <w:pPr>
-              <w:spacing w:before="0" w:after="0" w:line="240" w:lineRule="auto"/>
-              <w:jc w:val="center"/>
-              <w:rPr>
-                <w:sz w:val="14"/>
-                <w:szCs w:val="14"/>
-              </w:rPr>
-            </w:pPr>
-            <w:r>
-              <w:rPr>
-                <w:b w:val="0"/>
-                <w:sz w:val="14"/>
-              </w:rPr>
-              <w:t>16471.3</w:t>
-            </w:r>
-          </w:p>
-        </w:tc>
-        <w:tc>
-          <w:tcPr>
-            <w:tcW w:type="dxa" w:w="761"/>
-            <w:noWrap/>
-            <w:vAlign w:val="center"/>
-          </w:tcPr>
-          <w:p>
-            <w:pPr>
-              <w:spacing w:before="0" w:after="0" w:line="240" w:lineRule="auto"/>
-              <w:jc w:val="center"/>
-              <w:rPr>
-                <w:sz w:val="14"/>
-                <w:szCs w:val="14"/>
-              </w:rPr>
-            </w:pPr>
-            <w:r>
-              <w:rPr>
-                <w:b w:val="0"/>
-                <w:sz w:val="14"/>
-              </w:rPr>
-              <w:t>88961.8</w:t>
+            <w:tcW w:type="dxa" w:w="758"/>
+            <w:noWrap/>
+            <w:vAlign w:val="center"/>
+          </w:tcPr>
+          <w:p>
+            <w:pPr>
+              <w:spacing w:before="0" w:after="0" w:line="240" w:lineRule="auto"/>
+              <w:jc w:val="center"/>
+              <w:rPr>
+                <w:sz w:val="14"/>
+                <w:szCs w:val="14"/>
+              </w:rPr>
+            </w:pPr>
+            <w:r>
+              <w:rPr>
+                <w:b w:val="0"/>
+                <w:sz w:val="14"/>
+              </w:rPr>
+              <w:t>16471.2</w:t>
+            </w:r>
+          </w:p>
+        </w:tc>
+        <w:tc>
+          <w:tcPr>
+            <w:tcW w:type="dxa" w:w="758"/>
+            <w:noWrap/>
+            <w:vAlign w:val="center"/>
+          </w:tcPr>
+          <w:p>
+            <w:pPr>
+              <w:spacing w:before="0" w:after="0" w:line="240" w:lineRule="auto"/>
+              <w:jc w:val="center"/>
+              <w:rPr>
+                <w:sz w:val="14"/>
+                <w:szCs w:val="14"/>
+              </w:rPr>
+            </w:pPr>
+            <w:r>
+              <w:rPr>
+                <w:b w:val="0"/>
+                <w:sz w:val="14"/>
+              </w:rPr>
+              <w:t>88960.7</w:t>
             </w:r>
           </w:p>
         </w:tc>
@@ -18663,7 +18759,7 @@
                 <w:b w:val="0"/>
                 <w:sz w:val="14"/>
               </w:rPr>
-              <w:t>11238.4</w:t>
+              <w:t>11238.3</w:t>
             </w:r>
           </w:p>
         </w:tc>
@@ -18935,7 +19031,7 @@
         </w:tc>
         <w:tc>
           <w:tcPr>
-            <w:tcW w:type="dxa" w:w="528"/>
+            <w:tcW w:type="dxa" w:w="529"/>
             <w:noWrap/>
             <w:vAlign w:val="center"/>
           </w:tcPr>
@@ -18983,49 +19079,49 @@
         </w:tc>
         <w:tc>
           <w:tcPr>
-            <w:tcW w:type="dxa" w:w="753"/>
-            <w:noWrap/>
-            <w:vAlign w:val="center"/>
-          </w:tcPr>
-          <w:p>
-            <w:pPr>
-              <w:spacing w:before="0" w:after="0" w:line="240" w:lineRule="auto"/>
-              <w:jc w:val="center"/>
-              <w:rPr>
-                <w:sz w:val="14"/>
-                <w:szCs w:val="14"/>
-              </w:rPr>
-            </w:pPr>
-            <w:r>
-              <w:rPr>
-                <w:b w:val="0"/>
-                <w:sz w:val="14"/>
-              </w:rPr>
-              <w:t>13970.7</w:t>
-            </w:r>
-          </w:p>
-        </w:tc>
-        <w:tc>
-          <w:tcPr>
-            <w:tcW w:type="dxa" w:w="761"/>
-            <w:noWrap/>
-            <w:vAlign w:val="center"/>
-          </w:tcPr>
-          <w:p>
-            <w:pPr>
-              <w:spacing w:before="0" w:after="0" w:line="240" w:lineRule="auto"/>
-              <w:jc w:val="center"/>
-              <w:rPr>
-                <w:sz w:val="14"/>
-                <w:szCs w:val="14"/>
-              </w:rPr>
-            </w:pPr>
-            <w:r>
-              <w:rPr>
-                <w:b w:val="0"/>
-                <w:sz w:val="14"/>
-              </w:rPr>
-              <w:t>77723.4</w:t>
+            <w:tcW w:type="dxa" w:w="758"/>
+            <w:noWrap/>
+            <w:vAlign w:val="center"/>
+          </w:tcPr>
+          <w:p>
+            <w:pPr>
+              <w:spacing w:before="0" w:after="0" w:line="240" w:lineRule="auto"/>
+              <w:jc w:val="center"/>
+              <w:rPr>
+                <w:sz w:val="14"/>
+                <w:szCs w:val="14"/>
+              </w:rPr>
+            </w:pPr>
+            <w:r>
+              <w:rPr>
+                <w:b w:val="0"/>
+                <w:sz w:val="14"/>
+              </w:rPr>
+              <w:t>13970.6</w:t>
+            </w:r>
+          </w:p>
+        </w:tc>
+        <w:tc>
+          <w:tcPr>
+            <w:tcW w:type="dxa" w:w="758"/>
+            <w:noWrap/>
+            <w:vAlign w:val="center"/>
+          </w:tcPr>
+          <w:p>
+            <w:pPr>
+              <w:spacing w:before="0" w:after="0" w:line="240" w:lineRule="auto"/>
+              <w:jc w:val="center"/>
+              <w:rPr>
+                <w:sz w:val="14"/>
+                <w:szCs w:val="14"/>
+              </w:rPr>
+            </w:pPr>
+            <w:r>
+              <w:rPr>
+                <w:b w:val="0"/>
+                <w:sz w:val="14"/>
+              </w:rPr>
+              <w:t>77722.4</w:t>
             </w:r>
           </w:p>
         </w:tc>
@@ -19097,7 +19193,7 @@
                 <w:b w:val="0"/>
                 <w:sz w:val="14"/>
               </w:rPr>
-              <w:t>10530.1</w:t>
+              <w:t>10530.0</w:t>
             </w:r>
           </w:p>
         </w:tc>
@@ -19369,7 +19465,7 @@
         </w:tc>
         <w:tc>
           <w:tcPr>
-            <w:tcW w:type="dxa" w:w="528"/>
+            <w:tcW w:type="dxa" w:w="529"/>
             <w:noWrap/>
             <w:vAlign w:val="center"/>
           </w:tcPr>
@@ -19417,49 +19513,49 @@
         </w:tc>
         <w:tc>
           <w:tcPr>
-            <w:tcW w:type="dxa" w:w="753"/>
-            <w:noWrap/>
-            <w:vAlign w:val="center"/>
-          </w:tcPr>
-          <w:p>
-            <w:pPr>
-              <w:spacing w:before="0" w:after="0" w:line="240" w:lineRule="auto"/>
-              <w:jc w:val="center"/>
-              <w:rPr>
-                <w:sz w:val="14"/>
-                <w:szCs w:val="14"/>
-              </w:rPr>
-            </w:pPr>
-            <w:r>
-              <w:rPr>
-                <w:b w:val="0"/>
-                <w:sz w:val="14"/>
-              </w:rPr>
-              <w:t>11153.8</w:t>
-            </w:r>
-          </w:p>
-        </w:tc>
-        <w:tc>
-          <w:tcPr>
-            <w:tcW w:type="dxa" w:w="761"/>
-            <w:noWrap/>
-            <w:vAlign w:val="center"/>
-          </w:tcPr>
-          <w:p>
-            <w:pPr>
-              <w:spacing w:before="0" w:after="0" w:line="240" w:lineRule="auto"/>
-              <w:jc w:val="center"/>
-              <w:rPr>
-                <w:sz w:val="14"/>
-                <w:szCs w:val="14"/>
-              </w:rPr>
-            </w:pPr>
-            <w:r>
-              <w:rPr>
-                <w:b w:val="0"/>
-                <w:sz w:val="14"/>
-              </w:rPr>
-              <w:t>67193.3</w:t>
+            <w:tcW w:type="dxa" w:w="758"/>
+            <w:noWrap/>
+            <w:vAlign w:val="center"/>
+          </w:tcPr>
+          <w:p>
+            <w:pPr>
+              <w:spacing w:before="0" w:after="0" w:line="240" w:lineRule="auto"/>
+              <w:jc w:val="center"/>
+              <w:rPr>
+                <w:sz w:val="14"/>
+                <w:szCs w:val="14"/>
+              </w:rPr>
+            </w:pPr>
+            <w:r>
+              <w:rPr>
+                <w:b w:val="0"/>
+                <w:sz w:val="14"/>
+              </w:rPr>
+              <w:t>11153.7</w:t>
+            </w:r>
+          </w:p>
+        </w:tc>
+        <w:tc>
+          <w:tcPr>
+            <w:tcW w:type="dxa" w:w="758"/>
+            <w:noWrap/>
+            <w:vAlign w:val="center"/>
+          </w:tcPr>
+          <w:p>
+            <w:pPr>
+              <w:spacing w:before="0" w:after="0" w:line="240" w:lineRule="auto"/>
+              <w:jc w:val="center"/>
+              <w:rPr>
+                <w:sz w:val="14"/>
+                <w:szCs w:val="14"/>
+              </w:rPr>
+            </w:pPr>
+            <w:r>
+              <w:rPr>
+                <w:b w:val="0"/>
+                <w:sz w:val="14"/>
+              </w:rPr>
+              <w:t>67192.4</w:t>
             </w:r>
           </w:p>
         </w:tc>
@@ -19531,7 +19627,7 @@
                 <w:b w:val="0"/>
                 <w:sz w:val="14"/>
               </w:rPr>
-              <w:t>9392.2</w:t>
+              <w:t>9392.1</w:t>
             </w:r>
           </w:p>
         </w:tc>
@@ -19803,7 +19899,7 @@
         </w:tc>
         <w:tc>
           <w:tcPr>
-            <w:tcW w:type="dxa" w:w="528"/>
+            <w:tcW w:type="dxa" w:w="529"/>
             <w:noWrap/>
             <w:vAlign w:val="center"/>
           </w:tcPr>
@@ -19851,7 +19947,7 @@
         </w:tc>
         <w:tc>
           <w:tcPr>
-            <w:tcW w:type="dxa" w:w="753"/>
+            <w:tcW w:type="dxa" w:w="758"/>
             <w:noWrap/>
             <w:vAlign w:val="center"/>
           </w:tcPr>
@@ -19875,25 +19971,25 @@
         </w:tc>
         <w:tc>
           <w:tcPr>
-            <w:tcW w:type="dxa" w:w="761"/>
-            <w:noWrap/>
-            <w:vAlign w:val="center"/>
-          </w:tcPr>
-          <w:p>
-            <w:pPr>
-              <w:spacing w:before="0" w:after="0" w:line="240" w:lineRule="auto"/>
-              <w:jc w:val="center"/>
-              <w:rPr>
-                <w:sz w:val="14"/>
-                <w:szCs w:val="14"/>
-              </w:rPr>
-            </w:pPr>
-            <w:r>
-              <w:rPr>
-                <w:b w:val="0"/>
-                <w:sz w:val="14"/>
-              </w:rPr>
-              <w:t>57801.1</w:t>
+            <w:tcW w:type="dxa" w:w="758"/>
+            <w:noWrap/>
+            <w:vAlign w:val="center"/>
+          </w:tcPr>
+          <w:p>
+            <w:pPr>
+              <w:spacing w:before="0" w:after="0" w:line="240" w:lineRule="auto"/>
+              <w:jc w:val="center"/>
+              <w:rPr>
+                <w:sz w:val="14"/>
+                <w:szCs w:val="14"/>
+              </w:rPr>
+            </w:pPr>
+            <w:r>
+              <w:rPr>
+                <w:b w:val="0"/>
+                <w:sz w:val="14"/>
+              </w:rPr>
+              <w:t>57800.3</w:t>
             </w:r>
           </w:p>
         </w:tc>
@@ -19965,7 +20061,7 @@
                 <w:b w:val="0"/>
                 <w:sz w:val="14"/>
               </w:rPr>
-              <w:t>8561.3</w:t>
+              <w:t>8561.2</w:t>
             </w:r>
           </w:p>
         </w:tc>
@@ -20237,7 +20333,7 @@
         </w:tc>
         <w:tc>
           <w:tcPr>
-            <w:tcW w:type="dxa" w:w="528"/>
+            <w:tcW w:type="dxa" w:w="529"/>
             <w:noWrap/>
             <w:vAlign w:val="center"/>
           </w:tcPr>
@@ -20285,7 +20381,7 @@
         </w:tc>
         <w:tc>
           <w:tcPr>
-            <w:tcW w:type="dxa" w:w="753"/>
+            <w:tcW w:type="dxa" w:w="758"/>
             <w:noWrap/>
             <w:vAlign w:val="center"/>
           </w:tcPr>
@@ -20309,25 +20405,25 @@
         </w:tc>
         <w:tc>
           <w:tcPr>
-            <w:tcW w:type="dxa" w:w="761"/>
-            <w:noWrap/>
-            <w:vAlign w:val="center"/>
-          </w:tcPr>
-          <w:p>
-            <w:pPr>
-              <w:spacing w:before="0" w:after="0" w:line="240" w:lineRule="auto"/>
-              <w:jc w:val="center"/>
-              <w:rPr>
-                <w:sz w:val="14"/>
-                <w:szCs w:val="14"/>
-              </w:rPr>
-            </w:pPr>
-            <w:r>
-              <w:rPr>
-                <w:b w:val="0"/>
-                <w:sz w:val="14"/>
-              </w:rPr>
-              <w:t>49239.8</w:t>
+            <w:tcW w:type="dxa" w:w="758"/>
+            <w:noWrap/>
+            <w:vAlign w:val="center"/>
+          </w:tcPr>
+          <w:p>
+            <w:pPr>
+              <w:spacing w:before="0" w:after="0" w:line="240" w:lineRule="auto"/>
+              <w:jc w:val="center"/>
+              <w:rPr>
+                <w:sz w:val="14"/>
+                <w:szCs w:val="14"/>
+              </w:rPr>
+            </w:pPr>
+            <w:r>
+              <w:rPr>
+                <w:b w:val="0"/>
+                <w:sz w:val="14"/>
+              </w:rPr>
+              <w:t>49239.1</w:t>
             </w:r>
           </w:p>
         </w:tc>
@@ -20399,7 +20495,7 @@
                 <w:b w:val="0"/>
                 <w:sz w:val="14"/>
               </w:rPr>
-              <w:t>8829.9</w:t>
+              <w:t>8829.7</w:t>
             </w:r>
           </w:p>
         </w:tc>
@@ -20671,7 +20767,7 @@
         </w:tc>
         <w:tc>
           <w:tcPr>
-            <w:tcW w:type="dxa" w:w="528"/>
+            <w:tcW w:type="dxa" w:w="529"/>
             <w:noWrap/>
             <w:vAlign w:val="center"/>
           </w:tcPr>
@@ -20719,7 +20815,7 @@
         </w:tc>
         <w:tc>
           <w:tcPr>
-            <w:tcW w:type="dxa" w:w="753"/>
+            <w:tcW w:type="dxa" w:w="758"/>
             <w:noWrap/>
             <w:vAlign w:val="center"/>
           </w:tcPr>
@@ -20743,25 +20839,25 @@
         </w:tc>
         <w:tc>
           <w:tcPr>
-            <w:tcW w:type="dxa" w:w="761"/>
-            <w:noWrap/>
-            <w:vAlign w:val="center"/>
-          </w:tcPr>
-          <w:p>
-            <w:pPr>
-              <w:spacing w:before="0" w:after="0" w:line="240" w:lineRule="auto"/>
-              <w:jc w:val="center"/>
-              <w:rPr>
-                <w:sz w:val="14"/>
-                <w:szCs w:val="14"/>
-              </w:rPr>
-            </w:pPr>
-            <w:r>
-              <w:rPr>
-                <w:b w:val="0"/>
-                <w:sz w:val="14"/>
-              </w:rPr>
-              <w:t>40410.0</w:t>
+            <w:tcW w:type="dxa" w:w="758"/>
+            <w:noWrap/>
+            <w:vAlign w:val="center"/>
+          </w:tcPr>
+          <w:p>
+            <w:pPr>
+              <w:spacing w:before="0" w:after="0" w:line="240" w:lineRule="auto"/>
+              <w:jc w:val="center"/>
+              <w:rPr>
+                <w:sz w:val="14"/>
+                <w:szCs w:val="14"/>
+              </w:rPr>
+            </w:pPr>
+            <w:r>
+              <w:rPr>
+                <w:b w:val="0"/>
+                <w:sz w:val="14"/>
+              </w:rPr>
+              <w:t>40409.4</w:t>
             </w:r>
           </w:p>
         </w:tc>
@@ -20833,7 +20929,7 @@
                 <w:b w:val="0"/>
                 <w:sz w:val="14"/>
               </w:rPr>
-              <w:t>8860.6</w:t>
+              <w:t>8860.5</w:t>
             </w:r>
           </w:p>
         </w:tc>
@@ -21105,7 +21201,7 @@
         </w:tc>
         <w:tc>
           <w:tcPr>
-            <w:tcW w:type="dxa" w:w="528"/>
+            <w:tcW w:type="dxa" w:w="529"/>
             <w:noWrap/>
             <w:vAlign w:val="center"/>
           </w:tcPr>
@@ -21153,49 +21249,49 @@
         </w:tc>
         <w:tc>
           <w:tcPr>
-            <w:tcW w:type="dxa" w:w="753"/>
-            <w:noWrap/>
-            <w:vAlign w:val="center"/>
-          </w:tcPr>
-          <w:p>
-            <w:pPr>
-              <w:spacing w:before="0" w:after="0" w:line="240" w:lineRule="auto"/>
-              <w:jc w:val="center"/>
-              <w:rPr>
-                <w:sz w:val="14"/>
-                <w:szCs w:val="14"/>
-              </w:rPr>
-            </w:pPr>
-            <w:r>
-              <w:rPr>
-                <w:b w:val="0"/>
-                <w:sz w:val="14"/>
-              </w:rPr>
-              <w:t>8398.1</w:t>
-            </w:r>
-          </w:p>
-        </w:tc>
-        <w:tc>
-          <w:tcPr>
-            <w:tcW w:type="dxa" w:w="761"/>
-            <w:noWrap/>
-            <w:vAlign w:val="center"/>
-          </w:tcPr>
-          <w:p>
-            <w:pPr>
-              <w:spacing w:before="0" w:after="0" w:line="240" w:lineRule="auto"/>
-              <w:jc w:val="center"/>
-              <w:rPr>
-                <w:sz w:val="14"/>
-                <w:szCs w:val="14"/>
-              </w:rPr>
-            </w:pPr>
-            <w:r>
-              <w:rPr>
-                <w:b w:val="0"/>
-                <w:sz w:val="14"/>
-              </w:rPr>
-              <w:t>31549.4</w:t>
+            <w:tcW w:type="dxa" w:w="758"/>
+            <w:noWrap/>
+            <w:vAlign w:val="center"/>
+          </w:tcPr>
+          <w:p>
+            <w:pPr>
+              <w:spacing w:before="0" w:after="0" w:line="240" w:lineRule="auto"/>
+              <w:jc w:val="center"/>
+              <w:rPr>
+                <w:sz w:val="14"/>
+                <w:szCs w:val="14"/>
+              </w:rPr>
+            </w:pPr>
+            <w:r>
+              <w:rPr>
+                <w:b w:val="0"/>
+                <w:sz w:val="14"/>
+              </w:rPr>
+              <w:t>8398.0</w:t>
+            </w:r>
+          </w:p>
+        </w:tc>
+        <w:tc>
+          <w:tcPr>
+            <w:tcW w:type="dxa" w:w="758"/>
+            <w:noWrap/>
+            <w:vAlign w:val="center"/>
+          </w:tcPr>
+          <w:p>
+            <w:pPr>
+              <w:spacing w:before="0" w:after="0" w:line="240" w:lineRule="auto"/>
+              <w:jc w:val="center"/>
+              <w:rPr>
+                <w:sz w:val="14"/>
+                <w:szCs w:val="14"/>
+              </w:rPr>
+            </w:pPr>
+            <w:r>
+              <w:rPr>
+                <w:b w:val="0"/>
+                <w:sz w:val="14"/>
+              </w:rPr>
+              <w:t>31548.9</w:t>
             </w:r>
           </w:p>
         </w:tc>
@@ -21267,7 +21363,7 @@
                 <w:b w:val="0"/>
                 <w:sz w:val="14"/>
               </w:rPr>
-              <w:t>8597.7</w:t>
+              <w:t>8597.6</w:t>
             </w:r>
           </w:p>
         </w:tc>
@@ -21539,7 +21635,7 @@
         </w:tc>
         <w:tc>
           <w:tcPr>
-            <w:tcW w:type="dxa" w:w="528"/>
+            <w:tcW w:type="dxa" w:w="529"/>
             <w:noWrap/>
             <w:vAlign w:val="center"/>
           </w:tcPr>
@@ -21587,7 +21683,7 @@
         </w:tc>
         <w:tc>
           <w:tcPr>
-            <w:tcW w:type="dxa" w:w="753"/>
+            <w:tcW w:type="dxa" w:w="758"/>
             <w:noWrap/>
             <w:vAlign w:val="center"/>
           </w:tcPr>
@@ -21611,25 +21707,25 @@
         </w:tc>
         <w:tc>
           <w:tcPr>
-            <w:tcW w:type="dxa" w:w="761"/>
-            <w:noWrap/>
-            <w:vAlign w:val="center"/>
-          </w:tcPr>
-          <w:p>
-            <w:pPr>
-              <w:spacing w:before="0" w:after="0" w:line="240" w:lineRule="auto"/>
-              <w:jc w:val="center"/>
-              <w:rPr>
-                <w:sz w:val="14"/>
-                <w:szCs w:val="14"/>
-              </w:rPr>
-            </w:pPr>
-            <w:r>
-              <w:rPr>
-                <w:b w:val="0"/>
-                <w:sz w:val="14"/>
-              </w:rPr>
-              <w:t>22951.6</w:t>
+            <w:tcW w:type="dxa" w:w="758"/>
+            <w:noWrap/>
+            <w:vAlign w:val="center"/>
+          </w:tcPr>
+          <w:p>
+            <w:pPr>
+              <w:spacing w:before="0" w:after="0" w:line="240" w:lineRule="auto"/>
+              <w:jc w:val="center"/>
+              <w:rPr>
+                <w:sz w:val="14"/>
+                <w:szCs w:val="14"/>
+              </w:rPr>
+            </w:pPr>
+            <w:r>
+              <w:rPr>
+                <w:b w:val="0"/>
+                <w:sz w:val="14"/>
+              </w:rPr>
+              <w:t>22951.3</w:t>
             </w:r>
           </w:p>
         </w:tc>
@@ -21701,7 +21797,7 @@
                 <w:b w:val="0"/>
                 <w:sz w:val="14"/>
               </w:rPr>
-              <w:t>7972.2</w:t>
+              <w:t>7972.1</w:t>
             </w:r>
           </w:p>
         </w:tc>
@@ -21973,7 +22069,7 @@
         </w:tc>
         <w:tc>
           <w:tcPr>
-            <w:tcW w:type="dxa" w:w="528"/>
+            <w:tcW w:type="dxa" w:w="529"/>
             <w:noWrap/>
             <w:vAlign w:val="center"/>
           </w:tcPr>
@@ -22021,49 +22117,49 @@
         </w:tc>
         <w:tc>
           <w:tcPr>
-            <w:tcW w:type="dxa" w:w="753"/>
-            <w:noWrap/>
-            <w:vAlign w:val="center"/>
-          </w:tcPr>
-          <w:p>
-            <w:pPr>
-              <w:spacing w:before="0" w:after="0" w:line="240" w:lineRule="auto"/>
-              <w:jc w:val="center"/>
-              <w:rPr>
-                <w:sz w:val="14"/>
-                <w:szCs w:val="14"/>
-              </w:rPr>
-            </w:pPr>
-            <w:r>
-              <w:rPr>
-                <w:b w:val="0"/>
-                <w:sz w:val="14"/>
-              </w:rPr>
-              <w:t>6304.9</w:t>
-            </w:r>
-          </w:p>
-        </w:tc>
-        <w:tc>
-          <w:tcPr>
-            <w:tcW w:type="dxa" w:w="761"/>
-            <w:noWrap/>
-            <w:vAlign w:val="center"/>
-          </w:tcPr>
-          <w:p>
-            <w:pPr>
-              <w:spacing w:before="0" w:after="0" w:line="240" w:lineRule="auto"/>
-              <w:jc w:val="center"/>
-              <w:rPr>
-                <w:sz w:val="14"/>
-                <w:szCs w:val="14"/>
-              </w:rPr>
-            </w:pPr>
-            <w:r>
-              <w:rPr>
-                <w:b w:val="0"/>
-                <w:sz w:val="14"/>
-              </w:rPr>
-              <w:t>14979.4</w:t>
+            <w:tcW w:type="dxa" w:w="758"/>
+            <w:noWrap/>
+            <w:vAlign w:val="center"/>
+          </w:tcPr>
+          <w:p>
+            <w:pPr>
+              <w:spacing w:before="0" w:after="0" w:line="240" w:lineRule="auto"/>
+              <w:jc w:val="center"/>
+              <w:rPr>
+                <w:sz w:val="14"/>
+                <w:szCs w:val="14"/>
+              </w:rPr>
+            </w:pPr>
+            <w:r>
+              <w:rPr>
+                <w:b w:val="0"/>
+                <w:sz w:val="14"/>
+              </w:rPr>
+              <w:t>6304.8</w:t>
+            </w:r>
+          </w:p>
+        </w:tc>
+        <w:tc>
+          <w:tcPr>
+            <w:tcW w:type="dxa" w:w="758"/>
+            <w:noWrap/>
+            <w:vAlign w:val="center"/>
+          </w:tcPr>
+          <w:p>
+            <w:pPr>
+              <w:spacing w:before="0" w:after="0" w:line="240" w:lineRule="auto"/>
+              <w:jc w:val="center"/>
+              <w:rPr>
+                <w:sz w:val="14"/>
+                <w:szCs w:val="14"/>
+              </w:rPr>
+            </w:pPr>
+            <w:r>
+              <w:rPr>
+                <w:b w:val="0"/>
+                <w:sz w:val="14"/>
+              </w:rPr>
+              <w:t>14979.2</w:t>
             </w:r>
           </w:p>
         </w:tc>
@@ -22135,7 +22231,7 @@
                 <w:b w:val="0"/>
                 <w:sz w:val="14"/>
               </w:rPr>
-              <w:t>6894.5</w:t>
+              <w:t>6894.4</w:t>
             </w:r>
           </w:p>
         </w:tc>
@@ -22407,7 +22503,7 @@
         </w:tc>
         <w:tc>
           <w:tcPr>
-            <w:tcW w:type="dxa" w:w="528"/>
+            <w:tcW w:type="dxa" w:w="529"/>
             <w:noWrap/>
             <w:vAlign w:val="center"/>
           </w:tcPr>
@@ -22455,49 +22551,49 @@
         </w:tc>
         <w:tc>
           <w:tcPr>
-            <w:tcW w:type="dxa" w:w="753"/>
-            <w:noWrap/>
-            <w:vAlign w:val="center"/>
-          </w:tcPr>
-          <w:p>
-            <w:pPr>
-              <w:spacing w:before="0" w:after="0" w:line="240" w:lineRule="auto"/>
-              <w:jc w:val="center"/>
-              <w:rPr>
-                <w:sz w:val="14"/>
-                <w:szCs w:val="14"/>
-              </w:rPr>
-            </w:pPr>
-            <w:r>
-              <w:rPr>
-                <w:b w:val="0"/>
-                <w:sz w:val="14"/>
-              </w:rPr>
-              <w:t>4616.0</w:t>
-            </w:r>
-          </w:p>
-        </w:tc>
-        <w:tc>
-          <w:tcPr>
-            <w:tcW w:type="dxa" w:w="761"/>
-            <w:noWrap/>
-            <w:vAlign w:val="center"/>
-          </w:tcPr>
-          <w:p>
-            <w:pPr>
-              <w:spacing w:before="0" w:after="0" w:line="240" w:lineRule="auto"/>
-              <w:jc w:val="center"/>
-              <w:rPr>
-                <w:sz w:val="14"/>
-                <w:szCs w:val="14"/>
-              </w:rPr>
-            </w:pPr>
-            <w:r>
-              <w:rPr>
-                <w:b w:val="0"/>
-                <w:sz w:val="14"/>
-              </w:rPr>
-              <w:t>8084.9</w:t>
+            <w:tcW w:type="dxa" w:w="758"/>
+            <w:noWrap/>
+            <w:vAlign w:val="center"/>
+          </w:tcPr>
+          <w:p>
+            <w:pPr>
+              <w:spacing w:before="0" w:after="0" w:line="240" w:lineRule="auto"/>
+              <w:jc w:val="center"/>
+              <w:rPr>
+                <w:sz w:val="14"/>
+                <w:szCs w:val="14"/>
+              </w:rPr>
+            </w:pPr>
+            <w:r>
+              <w:rPr>
+                <w:b w:val="0"/>
+                <w:sz w:val="14"/>
+              </w:rPr>
+              <w:t>4615.9</w:t>
+            </w:r>
+          </w:p>
+        </w:tc>
+        <w:tc>
+          <w:tcPr>
+            <w:tcW w:type="dxa" w:w="758"/>
+            <w:noWrap/>
+            <w:vAlign w:val="center"/>
+          </w:tcPr>
+          <w:p>
+            <w:pPr>
+              <w:spacing w:before="0" w:after="0" w:line="240" w:lineRule="auto"/>
+              <w:jc w:val="center"/>
+              <w:rPr>
+                <w:sz w:val="14"/>
+                <w:szCs w:val="14"/>
+              </w:rPr>
+            </w:pPr>
+            <w:r>
+              <w:rPr>
+                <w:b w:val="0"/>
+                <w:sz w:val="14"/>
+              </w:rPr>
+              <w:t>8084.8</w:t>
             </w:r>
           </w:p>
         </w:tc>
@@ -22569,7 +22665,7 @@
                 <w:b w:val="0"/>
                 <w:sz w:val="14"/>
               </w:rPr>
-              <w:t>5241.8</w:t>
+              <w:t>5241.7</w:t>
             </w:r>
           </w:p>
         </w:tc>
@@ -22841,7 +22937,7 @@
         </w:tc>
         <w:tc>
           <w:tcPr>
-            <w:tcW w:type="dxa" w:w="528"/>
+            <w:tcW w:type="dxa" w:w="529"/>
             <w:noWrap/>
             <w:vAlign w:val="center"/>
           </w:tcPr>
@@ -22889,7 +22985,7 @@
         </w:tc>
         <w:tc>
           <w:tcPr>
-            <w:tcW w:type="dxa" w:w="753"/>
+            <w:tcW w:type="dxa" w:w="758"/>
             <w:noWrap/>
             <w:vAlign w:val="center"/>
           </w:tcPr>
@@ -22913,7 +23009,7 @@
         </w:tc>
         <w:tc>
           <w:tcPr>
-            <w:tcW w:type="dxa" w:w="761"/>
+            <w:tcW w:type="dxa" w:w="758"/>
             <w:noWrap/>
             <w:vAlign w:val="center"/>
           </w:tcPr>
@@ -23292,7 +23388,7 @@
         </w:tc>
         <w:tc>
           <w:tcPr>
-            <w:tcW w:type="dxa" w:w="528"/>
+            <w:tcW w:type="dxa" w:w="529"/>
             <w:tcBorders>
               <w:top w:val="single" w:sz="8" w:space="0" w:color="auto"/>
             </w:tcBorders>
@@ -23342,7 +23438,7 @@
         </w:tc>
         <w:tc>
           <w:tcPr>
-            <w:tcW w:type="dxa" w:w="753"/>
+            <w:tcW w:type="dxa" w:w="758"/>
             <w:tcBorders>
               <w:top w:val="single" w:sz="8" w:space="0" w:color="auto"/>
             </w:tcBorders>
@@ -23363,13 +23459,13 @@
                 <w:b/>
                 <w:sz w:val="14"/>
               </w:rPr>
-              <w:t>982142.0</w:t>
-            </w:r>
-          </w:p>
-        </w:tc>
-        <w:tc>
-          <w:tcPr>
-            <w:tcW w:type="dxa" w:w="761"/>
+              <w:t>982161.7</w:t>
+            </w:r>
+          </w:p>
+        </w:tc>
+        <w:tc>
+          <w:tcPr>
+            <w:tcW w:type="dxa" w:w="758"/>
             <w:tcBorders>
               <w:top w:val="single" w:sz="8" w:space="0" w:color="auto"/>
             </w:tcBorders>
@@ -26516,7 +26612,7 @@
             </m:e>
           </m:nary>
           <m:r>
-            <m:t xml:space="preserve"> = -1.000e-11</m:t>
+            <m:t xml:space="preserve"> = -3.729e-11</m:t>
           </m:r>
         </m:oMath>
       </m:oMathPara>
@@ -26527,7 +26623,7 @@
         <w:keepNext w:val="0"/>
       </w:pPr>
       <w:r>
-        <w:t xml:space="preserve">That is one part in 37,125 trillion of the 371418 the magnitudes of Q come to. The moment equation weights the same column by </w:t>
+        <w:t xml:space="preserve">That is one part in 9,960 trillion of the 371411 the magnitudes of Q come to. The moment equation weights the same column by </w:t>
       </w:r>
       <m:oMath>
         <m:sSub>
@@ -26653,7 +26749,7 @@
             </m:e>
           </m:nary>
           <m:r>
-            <m:t xml:space="preserve"> = 5.355e-09</m:t>
+            <m:t xml:space="preserve"> = 9.080e-09</m:t>
           </m:r>
         </m:oMath>
       </m:oMathPara>
@@ -26664,7 +26760,7 @@
         <w:keepNext w:val="0"/>
       </w:pPr>
       <w:r>
-        <w:t>That is one part in 15,749 trillion of the 84337150 its moment terms come to. Sums re-formed from the printed, rounded columns carry that rounding and close to within a thousandth of these totals.</w:t>
+        <w:t>That is one part in 9,288 trillion of the 84335269 its moment terms come to. Sums re-formed from the printed, rounded columns carry that rounding and close to within a thousandth of these totals.</w:t>
       </w:r>
     </w:p>
     <w:p>
@@ -27947,7 +28043,7 @@
         </w:r>
       </w:hyperlink>
       <w:r>
-        <w:t xml:space="preserve"> shows the displacement at every node as an arrow — how the section is moving.</w:t>
+        <w:t xml:space="preserve"> shows the displacement at every node as an arrow — how the section is moving. The deformed grid is drawn at 0.71 times the computed displacement.</w:t>
       </w:r>
     </w:p>
     <w:p>
@@ -27958,7 +28054,7 @@
       <w:r>
         <w:drawing>
           <wp:inline xmlns:a="http://schemas.openxmlformats.org/drawingml/2006/main" xmlns:pic="http://schemas.openxmlformats.org/drawingml/2006/picture">
-            <wp:extent cx="5897880" cy="1712142"/>
+            <wp:extent cx="5897880" cy="1711113"/>
             <wp:docPr id="17" name="Picture 17"/>
             <wp:cNvGraphicFramePr>
               <a:graphicFrameLocks noChangeAspect="1"/>
@@ -27979,7 +28075,7 @@
                   <pic:spPr>
                     <a:xfrm>
                       <a:off x="0" y="0"/>
-                      <a:ext cx="5897880" cy="1712142"/>
+                      <a:ext cx="5897880" cy="1711113"/>
                     </a:xfrm>
                     <a:prstGeom prst="rect"/>
                   </pic:spPr>
@@ -28111,9 +28207,6 @@
         <w:pStyle w:val="BodyText"/>
         <w:keepNext/>
       </w:pPr>
-      <w:r>
-        <w:t xml:space="preserve">The strength reduction search is shown in </w:t>
-      </w:r>
       <w:hyperlink w:anchor="xslope_figure_20">
         <w:r>
           <w:rPr>
@@ -28124,7 +28217,7 @@
         </w:r>
       </w:hyperlink>
       <w:r>
-        <w:t>. It plots each of the 9 trials at its own reduction factor, marked by whether the section stood under that factor, with the bracket that remained after each trial.</w:t>
+        <w:t xml:space="preserve"> shows the maximum displacement of every trial against its strength reduction factor, for each of the 9 trials the search solved. The line joins the trials in which the slope reached equilibrium; an open marker is a trial that was stopped before it did, drawn where it was when it was stopped, still moving.</w:t>
       </w:r>
     </w:p>
     <w:p>
@@ -28135,7 +28228,7 @@
       <w:r>
         <w:drawing>
           <wp:inline xmlns:a="http://schemas.openxmlformats.org/drawingml/2006/main" xmlns:pic="http://schemas.openxmlformats.org/drawingml/2006/picture">
-            <wp:extent cx="5897880" cy="3577693"/>
+            <wp:extent cx="5897880" cy="3572330"/>
             <wp:docPr id="20" name="Picture 20"/>
             <wp:cNvGraphicFramePr>
               <a:graphicFrameLocks noChangeAspect="1"/>
@@ -28144,7 +28237,7 @@
               <a:graphicData uri="http://schemas.openxmlformats.org/drawingml/2006/picture">
                 <pic:pic>
                   <pic:nvPicPr>
-                    <pic:cNvPr id="0" name="fem_run1_search.png"/>
+                    <pic:cNvPr id="0" name="fem_run1_ssrm_curve.png"/>
                     <pic:cNvPicPr/>
                   </pic:nvPicPr>
                   <pic:blipFill>
@@ -28156,7 +28249,7 @@
                   <pic:spPr>
                     <a:xfrm>
                       <a:off x="0" y="0"/>
-                      <a:ext cx="5897880" cy="3577693"/>
+                      <a:ext cx="5897880" cy="3572330"/>
                     </a:xfrm>
                     <a:prstGeom prst="rect"/>
                   </pic:spPr>
@@ -28175,7 +28268,7 @@
       </w:pPr>
       <w:bookmarkStart w:id="47" w:name="xslope_figure_20"/>
       <w:r>
-        <w:t>Figure 20. Strength reduction search</w:t>
+        <w:t>Figure 20. Displacement vs F — strength reduction analysis</w:t>
       </w:r>
       <w:bookmarkEnd w:id="47"/>
     </w:p>

</xml_diff>